<commit_message>
Apply lecturer's comments: drop reliability table, renumber tables, align abstract and summary
Co-Authored-By: Claude Fable 5.1 <noreply@anthropic.com>
Claude-Session: https://claude.ai/code/session_01KHo5ZcKCUwhCAvyoKeeMWs
</commit_message>
<xml_diff>
--- a/seminar/סמינריון_רווחה_נפשית_ולגיטימיות.docx
+++ b/seminar/סמינריון_רווחה_נפשית_ולגיטימיות.docx
@@ -460,7 +460,7 @@
           <w:rtl/>
           <w:lang w:val="en-US" w:bidi="he-IL"/>
         </w:rPr>
-        <w:t xml:space="preserve"> נקודות מאלו ברמה הנמוכה. הממצאים תואמים מחקרים מהולנד, מאנגליה ומאוסטרליה, ומלמדים שרווחת האסיר ותפיסת הסגל כרוכות זו בזו. בסיום מוצעות המלצות יישומיות לניהול אגפים.</w:t>
+        <w:t xml:space="preserve"> נקודות מאלו ברמה הנמוכה. הממצאים תואמים מחקרים מהולנד, מאנגליה, מאוסטרליה ומארצות הברית, ומלמדים שרווחת האסיר ותפיסת הסגל כרוכות זו בזו. בסיום מוצעות המלצות יישומיות לניהול אגפים.</w:t>
       </w:r>
     </w:p>
     <w:p>
@@ -477,7 +477,7 @@
           <w:rtl/>
           <w:lang w:val="en-US" w:bidi="he-IL"/>
         </w:rPr>
-        <w:t xml:space="preserve">מילות מפתח: לגיטימיות, רווחה נפשית, צדק פרוצדורלי, אסירים שפוטים, שירות בתי הסוהר</w:t>
+        <w:t xml:space="preserve">מילות מפתח: לגיטימיות, רווחה נפשית, צדק פרוצדורלי, אסירים שפוטים, שירות בתי הסוהר.</w:t>
       </w:r>
     </w:p>
     <w:p>
@@ -513,7 +513,7 @@
           <w:szCs w:val="24"/>
           <w:lang w:val="en-US" w:bidi="he-IL"/>
         </w:rPr>
-        <w:t xml:space="preserve">This study examined to what extent mental well-being is associated with the perceived legitimacy of prison staff among sentenced prisoners in Israel. The theoretical framework draws on procedural justice theory and on the literature on adaptation to imprisonment. The data are synthetic and modeled on the Israel Prison Service living conditions survey conducted in autumn 2021; the analysis was restricted to 2,379 sentenced prisoners. Legitimacy was measured with three items and well-being with five, on a 1 to 5 scale. A significant, moderate positive correlation was found between well-being and legitimacy (r = .32, p &lt; .001): prisoners in the high-legitimacy group reported well-being about 0.7 points higher than those in the low-legitimacy group. The findings are consistent with studies from the Netherlands, England and Australia, and suggest that prisoners' well-being and their view of staff are intertwined. Practical recommendations for wing management are offered.</w:t>
+        <w:t xml:space="preserve">This study examined to what extent mental well-being is associated with the perceived legitimacy of prison staff among sentenced prisoners in Israel. The theoretical framework draws on procedural justice theory and on the literature on adaptation to imprisonment. The data are synthetic and modeled on the Israel Prison Service living conditions survey conducted in autumn 2021; the analysis was restricted to 2,379 sentenced prisoners. Legitimacy was measured with three items and well-being with five, on a 1 to 5 scale. A significant, moderate positive correlation was found between well-being and legitimacy (r = .32, p &lt; .001): prisoners in the high-legitimacy group reported well-being about 0.7 points higher than those in the low-legitimacy group. The findings are consistent with studies from the Netherlands, England, Australia and the United States, and suggest that prisoners' well-being and their view of staff are intertwined. Practical recommendations for wing management are offered.</w:t>
       </w:r>
     </w:p>
     <w:p>
@@ -528,7 +528,7 @@
           <w:szCs w:val="24"/>
           <w:lang w:val="en-US" w:bidi="he-IL"/>
         </w:rPr>
-        <w:t xml:space="preserve">Keywords: legitimacy, mental well-being, procedural justice, sentenced prisoners, Israel Prison Service</w:t>
+        <w:t xml:space="preserve">Keywords: legitimacy, mental well-being, procedural justice, sentenced prisoners, Israel Prison Service.</w:t>
       </w:r>
     </w:p>
     <w:p>
@@ -1274,44 +1274,6 @@
           <w:lang w:val="en-US" w:bidi="he-IL"/>
         </w:rPr>
         <w:t xml:space="preserve">).</w:t>
-      </w:r>
-    </w:p>
-    <w:p>
-      <w:pPr>
-        <w:pStyle w:val="Heading2"/>
-        <w:keepNext/>
-        <w:bidi/>
-        <w:spacing w:after="120" w:before="240" w:line="360"/>
-        <w:jc w:val="right"/>
-      </w:pPr>
-      <w:r>
-        <w:rPr>
-          <w:rFonts w:ascii="David" w:cs="David" w:eastAsia="David" w:hAnsi="David"/>
-          <w:b/>
-          <w:bCs/>
-          <w:sz w:val="28"/>
-          <w:szCs w:val="28"/>
-          <w:rtl/>
-          <w:lang w:val="en-US" w:bidi="he-IL"/>
-        </w:rPr>
-        <w:t xml:space="preserve">מטרת המחקר ומבנה העבודה</w:t>
-      </w:r>
-    </w:p>
-    <w:p>
-      <w:pPr>
-        <w:bidi/>
-        <w:spacing w:after="120" w:line="360"/>
-        <w:jc w:val="both"/>
-      </w:pPr>
-      <w:r>
-        <w:rPr>
-          <w:rFonts w:ascii="David" w:cs="David" w:eastAsia="David" w:hAnsi="David"/>
-          <w:sz w:val="24"/>
-          <w:szCs w:val="24"/>
-          <w:rtl/>
-          <w:lang w:val="en-US" w:bidi="he-IL"/>
-        </w:rPr>
-        <w:t xml:space="preserve">מטרת המחקר היא לבחון את הקשר בין רווחה נפשית לבין תפיסת הלגיטימיות של סגל הכליאה בקרב אסירים שפוטים. הלגיטימיות היא המשתנה התלוי והרווחה הנפשית היא המשתנה הבלתי תלוי. העבודה פותחת בסקירת ספרות בשני חלקים, הסתגלות למאסר ורווחה נפשית מצד אחד ולגיטימיות של סגל הכליאה מצד שני, ומסתיימת בשאלת המחקר ובהשערה. לאחר מכן מוצגים פרק השיטה, פרק הממצאים והדיון, ובסופם מגבלות המחקר, סיכום, גילוי נאות ורשימת המקורות. הפלטים הסטטיסטיים מובאים בנספח א'.</w:t>
       </w:r>
     </w:p>
     <w:p>
@@ -8957,7 +8919,7 @@
           <w:rtl/>
           <w:lang w:val="en-US" w:bidi="he-IL"/>
         </w:rPr>
-        <w:t xml:space="preserve"> מציג את הממוצעים, סטיות התקן ומדדי הצורה של שמונת הפריטים המרכיבים את שני הסולמות.</w:t>
+        <w:t xml:space="preserve"> מציג את הממוצעים, סטיות התקן ומדד האסימטריה של שמונת הפריטים המרכיבים את שני הסולמות.</w:t>
       </w:r>
     </w:p>
     <w:p>
@@ -11026,1732 +10988,216 @@
           <w:rtl/>
           <w:lang w:val="en-US" w:bidi="he-IL"/>
         </w:rPr>
-        <w:t xml:space="preserve">לוח </w:t>
-      </w:r>
-      <w:r>
-        <w:rPr>
-          <w:rFonts w:ascii="Times New Roman" w:cs="Times New Roman" w:eastAsia="Times New Roman" w:hAnsi="Times New Roman"/>
-          <w:noProof/>
-          <w:sz w:val="24"/>
-          <w:szCs w:val="24"/>
-          <w:lang w:val="en-US" w:bidi="he-IL"/>
-        </w:rPr>
-        <w:t xml:space="preserve">4</w:t>
-      </w:r>
-      <w:r>
-        <w:rPr>
-          <w:rFonts w:ascii="David" w:cs="David" w:eastAsia="David" w:hAnsi="David"/>
-          <w:sz w:val="24"/>
-          <w:szCs w:val="24"/>
-          <w:rtl/>
-          <w:lang w:val="en-US" w:bidi="he-IL"/>
-        </w:rPr>
-        <w:t xml:space="preserve"> מציג את הרכב שני הסולמות, מקדמי אלפא של </w:t>
-      </w:r>
-      <w:r>
-        <w:rPr>
-          <w:rFonts w:ascii="David" w:cs="David" w:eastAsia="David" w:hAnsi="David"/>
-          <w:noProof/>
-          <w:sz w:val="24"/>
-          <w:szCs w:val="24"/>
-          <w:rtl/>
-          <w:lang w:val="en-US" w:bidi="he-IL"/>
-        </w:rPr>
-        <w:t xml:space="preserve">קרונבך</w:t>
-      </w:r>
-      <w:r>
-        <w:rPr>
-          <w:rFonts w:ascii="David" w:cs="David" w:eastAsia="David" w:hAnsi="David"/>
-          <w:sz w:val="24"/>
-          <w:szCs w:val="24"/>
-          <w:rtl/>
-          <w:lang w:val="en-US" w:bidi="he-IL"/>
-        </w:rPr>
-        <w:t xml:space="preserve"> ומתאמי הפריט עם יתר הסולם.</w:t>
-      </w:r>
-    </w:p>
-    <w:p>
-      <w:pPr>
-        <w:keepNext/>
-        <w:bidi/>
-        <w:spacing w:after="80" w:before="200" w:line="360"/>
-        <w:jc w:val="right"/>
-      </w:pPr>
-      <w:r>
-        <w:rPr>
-          <w:rFonts w:ascii="David" w:cs="David" w:eastAsia="David" w:hAnsi="David"/>
-          <w:b/>
-          <w:bCs/>
-          <w:sz w:val="24"/>
-          <w:szCs w:val="24"/>
-          <w:rtl/>
-          <w:lang w:val="en-US" w:bidi="he-IL"/>
-        </w:rPr>
-        <w:t xml:space="preserve">לוח </w:t>
-      </w:r>
-      <w:r>
-        <w:rPr>
-          <w:rFonts w:ascii="Times New Roman" w:cs="Times New Roman" w:eastAsia="Times New Roman" w:hAnsi="Times New Roman"/>
-          <w:b/>
-          <w:bCs/>
-          <w:noProof/>
-          <w:sz w:val="24"/>
-          <w:szCs w:val="24"/>
-          <w:lang w:val="en-US" w:bidi="he-IL"/>
-        </w:rPr>
-        <w:t xml:space="preserve">4</w:t>
-      </w:r>
-      <w:r>
-        <w:rPr>
-          <w:rFonts w:ascii="David" w:cs="David" w:eastAsia="David" w:hAnsi="David"/>
-          <w:b/>
-          <w:bCs/>
-          <w:sz w:val="24"/>
-          <w:szCs w:val="24"/>
-          <w:rtl/>
-          <w:lang w:val="en-US" w:bidi="he-IL"/>
-        </w:rPr>
-        <w:t xml:space="preserve">: הרכב הסולמות ומהימנותם</w:t>
-      </w:r>
-    </w:p>
-    <w:tbl>
-      <w:tblPr>
-        <w:bidiVisual/>
-        <w:tblW w:type="dxa" w:w="8400"/>
-        <w:tblBorders>
-          <w:top w:val="single" w:color="000000" w:sz="4"/>
-          <w:left w:val="none" w:color="FFFFFF" w:sz="0"/>
-          <w:bottom w:val="single" w:color="000000" w:sz="4"/>
-          <w:right w:val="none" w:color="FFFFFF" w:sz="0"/>
-          <w:insideH w:val="none" w:color="FFFFFF" w:sz="0"/>
-          <w:insideV w:val="none" w:color="FFFFFF" w:sz="0"/>
-        </w:tblBorders>
-      </w:tblPr>
-      <w:tblGrid>
-        <w:gridCol w:w="3900"/>
-        <w:gridCol w:w="1700"/>
-        <w:gridCol w:w="1500"/>
-        <w:gridCol w:w="1300"/>
-      </w:tblGrid>
-      <w:tr>
-        <w:trPr>
-          <w:cantSplit/>
-          <w:tblHeader/>
-        </w:trPr>
-        <w:tc>
-          <w:tcPr>
-            <w:tcW w:type="dxa" w:w="3900"/>
-            <w:tcBorders>
-              <w:top w:val="single" w:color="000000" w:sz="4"/>
-              <w:left w:val="none" w:color="FFFFFF" w:sz="0"/>
-              <w:bottom w:val="single" w:color="000000" w:sz="4"/>
-              <w:right w:val="none" w:color="FFFFFF" w:sz="0"/>
-            </w:tcBorders>
-            <w:shd w:fill="EDEDED" w:color="auto" w:val="clear"/>
-            <w:tcMar>
-              <w:top w:type="dxa" w:w="50"/>
-              <w:left w:type="dxa" w:w="70"/>
-              <w:bottom w:type="dxa" w:w="50"/>
-              <w:right w:type="dxa" w:w="70"/>
-            </w:tcMar>
-          </w:tcPr>
-          <w:p>
-            <w:pPr>
-              <w:bidi/>
-              <w:spacing w:after="0" w:line="276"/>
-              <w:jc w:val="center"/>
-            </w:pPr>
-            <w:r>
-              <w:rPr>
-                <w:rFonts w:ascii="David" w:cs="David" w:eastAsia="David" w:hAnsi="David"/>
-                <w:b/>
-                <w:bCs/>
-                <w:sz w:val="22"/>
-                <w:szCs w:val="22"/>
-                <w:rtl/>
-                <w:lang w:val="en-US" w:bidi="he-IL"/>
-              </w:rPr>
-              <w:t xml:space="preserve">סולם ופריטים</w:t>
-            </w:r>
-          </w:p>
-        </w:tc>
-        <w:tc>
-          <w:tcPr>
-            <w:tcW w:type="dxa" w:w="1700"/>
-            <w:tcBorders>
-              <w:top w:val="single" w:color="000000" w:sz="4"/>
-              <w:left w:val="none" w:color="FFFFFF" w:sz="0"/>
-              <w:bottom w:val="single" w:color="000000" w:sz="4"/>
-              <w:right w:val="none" w:color="FFFFFF" w:sz="0"/>
-            </w:tcBorders>
-            <w:shd w:fill="EDEDED" w:color="auto" w:val="clear"/>
-            <w:tcMar>
-              <w:top w:type="dxa" w:w="50"/>
-              <w:left w:type="dxa" w:w="70"/>
-              <w:bottom w:type="dxa" w:w="50"/>
-              <w:right w:type="dxa" w:w="70"/>
-            </w:tcMar>
-          </w:tcPr>
-          <w:p>
-            <w:pPr>
-              <w:bidi/>
-              <w:spacing w:after="0" w:line="276"/>
-              <w:jc w:val="center"/>
-            </w:pPr>
-            <w:r>
-              <w:rPr>
-                <w:rFonts w:ascii="David" w:cs="David" w:eastAsia="David" w:hAnsi="David"/>
-                <w:b/>
-                <w:bCs/>
-                <w:sz w:val="22"/>
-                <w:szCs w:val="22"/>
-                <w:rtl/>
-                <w:lang w:val="en-US" w:bidi="he-IL"/>
-              </w:rPr>
-              <w:t xml:space="preserve">מתאם פריט-סולם מתוקן</w:t>
-            </w:r>
-          </w:p>
-        </w:tc>
-        <w:tc>
-          <w:tcPr>
-            <w:tcW w:type="dxa" w:w="1500"/>
-            <w:tcBorders>
-              <w:top w:val="single" w:color="000000" w:sz="4"/>
-              <w:left w:val="none" w:color="FFFFFF" w:sz="0"/>
-              <w:bottom w:val="single" w:color="000000" w:sz="4"/>
-              <w:right w:val="none" w:color="FFFFFF" w:sz="0"/>
-            </w:tcBorders>
-            <w:shd w:fill="EDEDED" w:color="auto" w:val="clear"/>
-            <w:tcMar>
-              <w:top w:type="dxa" w:w="50"/>
-              <w:left w:type="dxa" w:w="70"/>
-              <w:bottom w:type="dxa" w:w="50"/>
-              <w:right w:type="dxa" w:w="70"/>
-            </w:tcMar>
-          </w:tcPr>
-          <w:p>
-            <w:pPr>
-              <w:bidi/>
-              <w:spacing w:after="0" w:line="276"/>
-              <w:jc w:val="center"/>
-            </w:pPr>
-            <w:r>
-              <w:rPr>
-                <w:rFonts w:ascii="David" w:cs="David" w:eastAsia="David" w:hAnsi="David"/>
-                <w:b/>
-                <w:bCs/>
-                <w:sz w:val="22"/>
-                <w:szCs w:val="22"/>
-                <w:rtl/>
-                <w:lang w:val="en-US" w:bidi="he-IL"/>
-              </w:rPr>
-              <w:t xml:space="preserve">α אם הפריט מוסר</w:t>
-            </w:r>
-          </w:p>
-        </w:tc>
-        <w:tc>
-          <w:tcPr>
-            <w:tcW w:type="dxa" w:w="1300"/>
-            <w:tcBorders>
-              <w:top w:val="single" w:color="000000" w:sz="4"/>
-              <w:left w:val="none" w:color="FFFFFF" w:sz="0"/>
-              <w:bottom w:val="single" w:color="000000" w:sz="4"/>
-              <w:right w:val="none" w:color="FFFFFF" w:sz="0"/>
-            </w:tcBorders>
-            <w:shd w:fill="EDEDED" w:color="auto" w:val="clear"/>
-            <w:tcMar>
-              <w:top w:type="dxa" w:w="50"/>
-              <w:left w:type="dxa" w:w="70"/>
-              <w:bottom w:type="dxa" w:w="50"/>
-              <w:right w:type="dxa" w:w="70"/>
-            </w:tcMar>
-          </w:tcPr>
-          <w:p>
-            <w:pPr>
-              <w:bidi/>
-              <w:spacing w:after="0" w:line="276"/>
-              <w:jc w:val="center"/>
-            </w:pPr>
-            <w:r>
-              <w:rPr>
-                <w:rFonts w:ascii="David" w:cs="David" w:eastAsia="David" w:hAnsi="David"/>
-                <w:b/>
-                <w:bCs/>
-                <w:sz w:val="22"/>
-                <w:szCs w:val="22"/>
-                <w:rtl/>
-                <w:lang w:val="en-US" w:bidi="he-IL"/>
-              </w:rPr>
-              <w:t xml:space="preserve">α של הסולם</w:t>
-            </w:r>
-          </w:p>
-        </w:tc>
-      </w:tr>
-      <w:tr>
-        <w:trPr>
-          <w:cantSplit/>
-        </w:trPr>
-        <w:tc>
-          <w:tcPr>
-            <w:tcW w:type="dxa" w:w="3900"/>
-            <w:tcBorders>
-              <w:top w:val="none" w:color="FFFFFF" w:sz="0"/>
-              <w:left w:val="none" w:color="FFFFFF" w:sz="0"/>
-              <w:bottom w:val="none" w:color="FFFFFF" w:sz="0"/>
-              <w:right w:val="none" w:color="FFFFFF" w:sz="0"/>
-            </w:tcBorders>
-            <w:tcMar>
-              <w:top w:type="dxa" w:w="50"/>
-              <w:left w:type="dxa" w:w="70"/>
-              <w:bottom w:type="dxa" w:w="50"/>
-              <w:right w:type="dxa" w:w="70"/>
-            </w:tcMar>
-          </w:tcPr>
-          <w:p>
-            <w:pPr>
-              <w:bidi/>
-              <w:spacing w:after="0" w:line="276"/>
-              <w:jc w:val="right"/>
-            </w:pPr>
-            <w:r>
-              <w:rPr>
-                <w:rFonts w:ascii="David" w:cs="David" w:eastAsia="David" w:hAnsi="David"/>
-                <w:b w:val="false"/>
-                <w:bCs w:val="false"/>
-                <w:sz w:val="22"/>
-                <w:szCs w:val="22"/>
-                <w:rtl/>
-                <w:lang w:val="en-US" w:bidi="he-IL"/>
-              </w:rPr>
-              <w:t xml:space="preserve">לגיטימיות הסגל (</w:t>
-            </w:r>
-            <w:r>
-              <w:rPr>
-                <w:rFonts w:ascii="Times New Roman" w:cs="Times New Roman" w:eastAsia="Times New Roman" w:hAnsi="Times New Roman"/>
-                <w:b w:val="false"/>
-                <w:bCs w:val="false"/>
-                <w:noProof/>
-                <w:sz w:val="22"/>
-                <w:szCs w:val="22"/>
-                <w:lang w:val="en-US" w:bidi="he-IL"/>
-              </w:rPr>
-              <w:t xml:space="preserve">3</w:t>
-            </w:r>
-            <w:r>
-              <w:rPr>
-                <w:rFonts w:ascii="David" w:cs="David" w:eastAsia="David" w:hAnsi="David"/>
-                <w:b w:val="false"/>
-                <w:bCs w:val="false"/>
-                <w:sz w:val="22"/>
-                <w:szCs w:val="22"/>
-                <w:rtl/>
-                <w:lang w:val="en-US" w:bidi="he-IL"/>
-              </w:rPr>
-              <w:t xml:space="preserve"> פריטים, </w:t>
-            </w:r>
-            <w:r>
-              <w:rPr>
-                <w:rFonts w:ascii="Times New Roman" w:cs="Times New Roman" w:eastAsia="Times New Roman" w:hAnsi="Times New Roman"/>
-                <w:b w:val="false"/>
-                <w:bCs w:val="false"/>
-                <w:noProof/>
-                <w:sz w:val="22"/>
-                <w:szCs w:val="22"/>
-                <w:lang w:val="en-US" w:bidi="he-IL"/>
-              </w:rPr>
-              <w:t xml:space="preserve">n = 2,114</w:t>
-            </w:r>
-            <w:r>
-              <w:rPr>
-                <w:rFonts w:ascii="David" w:cs="David" w:eastAsia="David" w:hAnsi="David"/>
-                <w:b w:val="false"/>
-                <w:bCs w:val="false"/>
-                <w:sz w:val="22"/>
-                <w:szCs w:val="22"/>
-                <w:rtl/>
-                <w:lang w:val="en-US" w:bidi="he-IL"/>
-              </w:rPr>
-              <w:t xml:space="preserve">)</w:t>
-            </w:r>
-          </w:p>
-        </w:tc>
-        <w:tc>
-          <w:tcPr>
-            <w:tcW w:type="dxa" w:w="1700"/>
-            <w:tcBorders>
-              <w:top w:val="none" w:color="FFFFFF" w:sz="0"/>
-              <w:left w:val="none" w:color="FFFFFF" w:sz="0"/>
-              <w:bottom w:val="none" w:color="FFFFFF" w:sz="0"/>
-              <w:right w:val="none" w:color="FFFFFF" w:sz="0"/>
-            </w:tcBorders>
-            <w:tcMar>
-              <w:top w:type="dxa" w:w="50"/>
-              <w:left w:type="dxa" w:w="70"/>
-              <w:bottom w:type="dxa" w:w="50"/>
-              <w:right w:type="dxa" w:w="70"/>
-            </w:tcMar>
-          </w:tcPr>
-          <w:p>
-            <w:pPr>
-              <w:bidi w:val="false"/>
-              <w:spacing w:after="0" w:line="276"/>
-              <w:jc w:val="center"/>
-            </w:pPr>
-          </w:p>
-        </w:tc>
-        <w:tc>
-          <w:tcPr>
-            <w:tcW w:type="dxa" w:w="1500"/>
-            <w:tcBorders>
-              <w:top w:val="none" w:color="FFFFFF" w:sz="0"/>
-              <w:left w:val="none" w:color="FFFFFF" w:sz="0"/>
-              <w:bottom w:val="none" w:color="FFFFFF" w:sz="0"/>
-              <w:right w:val="none" w:color="FFFFFF" w:sz="0"/>
-            </w:tcBorders>
-            <w:tcMar>
-              <w:top w:type="dxa" w:w="50"/>
-              <w:left w:type="dxa" w:w="70"/>
-              <w:bottom w:type="dxa" w:w="50"/>
-              <w:right w:type="dxa" w:w="70"/>
-            </w:tcMar>
-          </w:tcPr>
-          <w:p>
-            <w:pPr>
-              <w:bidi w:val="false"/>
-              <w:spacing w:after="0" w:line="276"/>
-              <w:jc w:val="center"/>
-            </w:pPr>
-          </w:p>
-        </w:tc>
-        <w:tc>
-          <w:tcPr>
-            <w:tcW w:type="dxa" w:w="1300"/>
-            <w:tcBorders>
-              <w:top w:val="none" w:color="FFFFFF" w:sz="0"/>
-              <w:left w:val="none" w:color="FFFFFF" w:sz="0"/>
-              <w:bottom w:val="none" w:color="FFFFFF" w:sz="0"/>
-              <w:right w:val="none" w:color="FFFFFF" w:sz="0"/>
-            </w:tcBorders>
-            <w:tcMar>
-              <w:top w:type="dxa" w:w="50"/>
-              <w:left w:type="dxa" w:w="70"/>
-              <w:bottom w:type="dxa" w:w="50"/>
-              <w:right w:type="dxa" w:w="70"/>
-            </w:tcMar>
-          </w:tcPr>
-          <w:p>
-            <w:pPr>
-              <w:bidi w:val="false"/>
-              <w:spacing w:after="0" w:line="276"/>
-              <w:jc w:val="center"/>
-            </w:pPr>
-            <w:r>
-              <w:rPr>
-                <w:rFonts w:ascii="Times New Roman" w:cs="Times New Roman" w:eastAsia="Times New Roman" w:hAnsi="Times New Roman"/>
-                <w:b w:val="false"/>
-                <w:bCs w:val="false"/>
-                <w:noProof/>
-                <w:sz w:val="22"/>
-                <w:szCs w:val="22"/>
-                <w:lang w:val="en-US" w:bidi="he-IL"/>
-              </w:rPr>
-              <w:t xml:space="preserve">0.67</w:t>
-            </w:r>
-          </w:p>
-        </w:tc>
-      </w:tr>
-      <w:tr>
-        <w:trPr>
-          <w:cantSplit/>
-        </w:trPr>
-        <w:tc>
-          <w:tcPr>
-            <w:tcW w:type="dxa" w:w="3900"/>
-            <w:tcBorders>
-              <w:top w:val="none" w:color="FFFFFF" w:sz="0"/>
-              <w:left w:val="none" w:color="FFFFFF" w:sz="0"/>
-              <w:bottom w:val="none" w:color="FFFFFF" w:sz="0"/>
-              <w:right w:val="none" w:color="FFFFFF" w:sz="0"/>
-            </w:tcBorders>
-            <w:tcMar>
-              <w:top w:type="dxa" w:w="50"/>
-              <w:left w:type="dxa" w:w="70"/>
-              <w:bottom w:type="dxa" w:w="50"/>
-              <w:right w:type="dxa" w:w="70"/>
-            </w:tcMar>
-          </w:tcPr>
-          <w:p>
-            <w:pPr>
-              <w:bidi/>
-              <w:spacing w:after="0" w:line="276"/>
-              <w:jc w:val="right"/>
-            </w:pPr>
-            <w:r>
-              <w:rPr>
-                <w:rFonts w:ascii="David" w:cs="David" w:eastAsia="David" w:hAnsi="David"/>
-                <w:b w:val="false"/>
-                <w:bCs w:val="false"/>
-                <w:sz w:val="22"/>
-                <w:szCs w:val="22"/>
-                <w:rtl/>
-                <w:lang w:val="en-US" w:bidi="he-IL"/>
-              </w:rPr>
-              <w:t xml:space="preserve">אפשר לדבר עם הסוהרים אם מודאג או עצוב</w:t>
-            </w:r>
-          </w:p>
-        </w:tc>
-        <w:tc>
-          <w:tcPr>
-            <w:tcW w:type="dxa" w:w="1700"/>
-            <w:tcBorders>
-              <w:top w:val="none" w:color="FFFFFF" w:sz="0"/>
-              <w:left w:val="none" w:color="FFFFFF" w:sz="0"/>
-              <w:bottom w:val="none" w:color="FFFFFF" w:sz="0"/>
-              <w:right w:val="none" w:color="FFFFFF" w:sz="0"/>
-            </w:tcBorders>
-            <w:tcMar>
-              <w:top w:type="dxa" w:w="50"/>
-              <w:left w:type="dxa" w:w="70"/>
-              <w:bottom w:type="dxa" w:w="50"/>
-              <w:right w:type="dxa" w:w="70"/>
-            </w:tcMar>
-          </w:tcPr>
-          <w:p>
-            <w:pPr>
-              <w:bidi w:val="false"/>
-              <w:spacing w:after="0" w:line="276"/>
-              <w:jc w:val="center"/>
-            </w:pPr>
-            <w:r>
-              <w:rPr>
-                <w:rFonts w:ascii="Times New Roman" w:cs="Times New Roman" w:eastAsia="Times New Roman" w:hAnsi="Times New Roman"/>
-                <w:b w:val="false"/>
-                <w:bCs w:val="false"/>
-                <w:noProof/>
-                <w:sz w:val="22"/>
-                <w:szCs w:val="22"/>
-                <w:lang w:val="en-US" w:bidi="he-IL"/>
-              </w:rPr>
-              <w:t xml:space="preserve">0.51</w:t>
-            </w:r>
-          </w:p>
-        </w:tc>
-        <w:tc>
-          <w:tcPr>
-            <w:tcW w:type="dxa" w:w="1500"/>
-            <w:tcBorders>
-              <w:top w:val="none" w:color="FFFFFF" w:sz="0"/>
-              <w:left w:val="none" w:color="FFFFFF" w:sz="0"/>
-              <w:bottom w:val="none" w:color="FFFFFF" w:sz="0"/>
-              <w:right w:val="none" w:color="FFFFFF" w:sz="0"/>
-            </w:tcBorders>
-            <w:tcMar>
-              <w:top w:type="dxa" w:w="50"/>
-              <w:left w:type="dxa" w:w="70"/>
-              <w:bottom w:type="dxa" w:w="50"/>
-              <w:right w:type="dxa" w:w="70"/>
-            </w:tcMar>
-          </w:tcPr>
-          <w:p>
-            <w:pPr>
-              <w:bidi w:val="false"/>
-              <w:spacing w:after="0" w:line="276"/>
-              <w:jc w:val="center"/>
-            </w:pPr>
-            <w:r>
-              <w:rPr>
-                <w:rFonts w:ascii="Times New Roman" w:cs="Times New Roman" w:eastAsia="Times New Roman" w:hAnsi="Times New Roman"/>
-                <w:b w:val="false"/>
-                <w:bCs w:val="false"/>
-                <w:noProof/>
-                <w:sz w:val="22"/>
-                <w:szCs w:val="22"/>
-                <w:lang w:val="en-US" w:bidi="he-IL"/>
-              </w:rPr>
-              <w:t xml:space="preserve">0.53</w:t>
-            </w:r>
-          </w:p>
-        </w:tc>
-        <w:tc>
-          <w:tcPr>
-            <w:tcW w:type="dxa" w:w="1300"/>
-            <w:tcBorders>
-              <w:top w:val="none" w:color="FFFFFF" w:sz="0"/>
-              <w:left w:val="none" w:color="FFFFFF" w:sz="0"/>
-              <w:bottom w:val="none" w:color="FFFFFF" w:sz="0"/>
-              <w:right w:val="none" w:color="FFFFFF" w:sz="0"/>
-            </w:tcBorders>
-            <w:tcMar>
-              <w:top w:type="dxa" w:w="50"/>
-              <w:left w:type="dxa" w:w="70"/>
-              <w:bottom w:type="dxa" w:w="50"/>
-              <w:right w:type="dxa" w:w="70"/>
-            </w:tcMar>
-          </w:tcPr>
-          <w:p>
-            <w:pPr>
-              <w:bidi w:val="false"/>
-              <w:spacing w:after="0" w:line="276"/>
-              <w:jc w:val="center"/>
-            </w:pPr>
-          </w:p>
-        </w:tc>
-      </w:tr>
-      <w:tr>
-        <w:trPr>
-          <w:cantSplit/>
-        </w:trPr>
-        <w:tc>
-          <w:tcPr>
-            <w:tcW w:type="dxa" w:w="3900"/>
-            <w:tcBorders>
-              <w:top w:val="none" w:color="FFFFFF" w:sz="0"/>
-              <w:left w:val="none" w:color="FFFFFF" w:sz="0"/>
-              <w:bottom w:val="none" w:color="FFFFFF" w:sz="0"/>
-              <w:right w:val="none" w:color="FFFFFF" w:sz="0"/>
-            </w:tcBorders>
-            <w:tcMar>
-              <w:top w:type="dxa" w:w="50"/>
-              <w:left w:type="dxa" w:w="70"/>
-              <w:bottom w:type="dxa" w:w="50"/>
-              <w:right w:type="dxa" w:w="70"/>
-            </w:tcMar>
-          </w:tcPr>
-          <w:p>
-            <w:pPr>
-              <w:bidi/>
-              <w:spacing w:after="0" w:line="276"/>
-              <w:jc w:val="right"/>
-            </w:pPr>
-            <w:r>
-              <w:rPr>
-                <w:rFonts w:ascii="David" w:cs="David" w:eastAsia="David" w:hAnsi="David"/>
-                <w:b w:val="false"/>
-                <w:bCs w:val="false"/>
-                <w:sz w:val="22"/>
-                <w:szCs w:val="22"/>
-                <w:rtl/>
-                <w:lang w:val="en-US" w:bidi="he-IL"/>
-              </w:rPr>
-              <w:t xml:space="preserve">הסוהרים מתייחסים אליי בכבוד</w:t>
-            </w:r>
-          </w:p>
-        </w:tc>
-        <w:tc>
-          <w:tcPr>
-            <w:tcW w:type="dxa" w:w="1700"/>
-            <w:tcBorders>
-              <w:top w:val="none" w:color="FFFFFF" w:sz="0"/>
-              <w:left w:val="none" w:color="FFFFFF" w:sz="0"/>
-              <w:bottom w:val="none" w:color="FFFFFF" w:sz="0"/>
-              <w:right w:val="none" w:color="FFFFFF" w:sz="0"/>
-            </w:tcBorders>
-            <w:tcMar>
-              <w:top w:type="dxa" w:w="50"/>
-              <w:left w:type="dxa" w:w="70"/>
-              <w:bottom w:type="dxa" w:w="50"/>
-              <w:right w:type="dxa" w:w="70"/>
-            </w:tcMar>
-          </w:tcPr>
-          <w:p>
-            <w:pPr>
-              <w:bidi w:val="false"/>
-              <w:spacing w:after="0" w:line="276"/>
-              <w:jc w:val="center"/>
-            </w:pPr>
-            <w:r>
-              <w:rPr>
-                <w:rFonts w:ascii="Times New Roman" w:cs="Times New Roman" w:eastAsia="Times New Roman" w:hAnsi="Times New Roman"/>
-                <w:b w:val="false"/>
-                <w:bCs w:val="false"/>
-                <w:noProof/>
-                <w:sz w:val="22"/>
-                <w:szCs w:val="22"/>
-                <w:lang w:val="en-US" w:bidi="he-IL"/>
-              </w:rPr>
-              <w:t xml:space="preserve">0.57</w:t>
-            </w:r>
-          </w:p>
-        </w:tc>
-        <w:tc>
-          <w:tcPr>
-            <w:tcW w:type="dxa" w:w="1500"/>
-            <w:tcBorders>
-              <w:top w:val="none" w:color="FFFFFF" w:sz="0"/>
-              <w:left w:val="none" w:color="FFFFFF" w:sz="0"/>
-              <w:bottom w:val="none" w:color="FFFFFF" w:sz="0"/>
-              <w:right w:val="none" w:color="FFFFFF" w:sz="0"/>
-            </w:tcBorders>
-            <w:tcMar>
-              <w:top w:type="dxa" w:w="50"/>
-              <w:left w:type="dxa" w:w="70"/>
-              <w:bottom w:type="dxa" w:w="50"/>
-              <w:right w:type="dxa" w:w="70"/>
-            </w:tcMar>
-          </w:tcPr>
-          <w:p>
-            <w:pPr>
-              <w:bidi w:val="false"/>
-              <w:spacing w:after="0" w:line="276"/>
-              <w:jc w:val="center"/>
-            </w:pPr>
-            <w:r>
-              <w:rPr>
-                <w:rFonts w:ascii="Times New Roman" w:cs="Times New Roman" w:eastAsia="Times New Roman" w:hAnsi="Times New Roman"/>
-                <w:b w:val="false"/>
-                <w:bCs w:val="false"/>
-                <w:noProof/>
-                <w:sz w:val="22"/>
-                <w:szCs w:val="22"/>
-                <w:lang w:val="en-US" w:bidi="he-IL"/>
-              </w:rPr>
-              <w:t xml:space="preserve">0.50</w:t>
-            </w:r>
-          </w:p>
-        </w:tc>
-        <w:tc>
-          <w:tcPr>
-            <w:tcW w:type="dxa" w:w="1300"/>
-            <w:tcBorders>
-              <w:top w:val="none" w:color="FFFFFF" w:sz="0"/>
-              <w:left w:val="none" w:color="FFFFFF" w:sz="0"/>
-              <w:bottom w:val="none" w:color="FFFFFF" w:sz="0"/>
-              <w:right w:val="none" w:color="FFFFFF" w:sz="0"/>
-            </w:tcBorders>
-            <w:tcMar>
-              <w:top w:type="dxa" w:w="50"/>
-              <w:left w:type="dxa" w:w="70"/>
-              <w:bottom w:type="dxa" w:w="50"/>
-              <w:right w:type="dxa" w:w="70"/>
-            </w:tcMar>
-          </w:tcPr>
-          <w:p>
-            <w:pPr>
-              <w:bidi w:val="false"/>
-              <w:spacing w:after="0" w:line="276"/>
-              <w:jc w:val="center"/>
-            </w:pPr>
-          </w:p>
-        </w:tc>
-      </w:tr>
-      <w:tr>
-        <w:trPr>
-          <w:cantSplit/>
-        </w:trPr>
-        <w:tc>
-          <w:tcPr>
-            <w:tcW w:type="dxa" w:w="3900"/>
-            <w:tcBorders>
-              <w:top w:val="none" w:color="FFFFFF" w:sz="0"/>
-              <w:left w:val="none" w:color="FFFFFF" w:sz="0"/>
-              <w:bottom w:val="none" w:color="FFFFFF" w:sz="0"/>
-              <w:right w:val="none" w:color="FFFFFF" w:sz="0"/>
-            </w:tcBorders>
-            <w:tcMar>
-              <w:top w:type="dxa" w:w="50"/>
-              <w:left w:type="dxa" w:w="70"/>
-              <w:bottom w:type="dxa" w:w="50"/>
-              <w:right w:type="dxa" w:w="70"/>
-            </w:tcMar>
-          </w:tcPr>
-          <w:p>
-            <w:pPr>
-              <w:bidi/>
-              <w:spacing w:after="0" w:line="276"/>
-              <w:jc w:val="right"/>
-            </w:pPr>
-            <w:r>
-              <w:rPr>
-                <w:rFonts w:ascii="David" w:cs="David" w:eastAsia="David" w:hAnsi="David"/>
-                <w:b w:val="false"/>
-                <w:bCs w:val="false"/>
-                <w:sz w:val="22"/>
-                <w:szCs w:val="22"/>
-                <w:rtl/>
-                <w:lang w:val="en-US" w:bidi="he-IL"/>
-              </w:rPr>
-              <w:t xml:space="preserve">שביעות רצון מהטיפול בבקשות</w:t>
-            </w:r>
-          </w:p>
-        </w:tc>
-        <w:tc>
-          <w:tcPr>
-            <w:tcW w:type="dxa" w:w="1700"/>
-            <w:tcBorders>
-              <w:top w:val="none" w:color="FFFFFF" w:sz="0"/>
-              <w:left w:val="none" w:color="FFFFFF" w:sz="0"/>
-              <w:bottom w:val="none" w:color="FFFFFF" w:sz="0"/>
-              <w:right w:val="none" w:color="FFFFFF" w:sz="0"/>
-            </w:tcBorders>
-            <w:tcMar>
-              <w:top w:type="dxa" w:w="50"/>
-              <w:left w:type="dxa" w:w="70"/>
-              <w:bottom w:type="dxa" w:w="50"/>
-              <w:right w:type="dxa" w:w="70"/>
-            </w:tcMar>
-          </w:tcPr>
-          <w:p>
-            <w:pPr>
-              <w:bidi w:val="false"/>
-              <w:spacing w:after="0" w:line="276"/>
-              <w:jc w:val="center"/>
-            </w:pPr>
-            <w:r>
-              <w:rPr>
-                <w:rFonts w:ascii="Times New Roman" w:cs="Times New Roman" w:eastAsia="Times New Roman" w:hAnsi="Times New Roman"/>
-                <w:b w:val="false"/>
-                <w:bCs w:val="false"/>
-                <w:noProof/>
-                <w:sz w:val="22"/>
-                <w:szCs w:val="22"/>
-                <w:lang w:val="en-US" w:bidi="he-IL"/>
-              </w:rPr>
-              <w:t xml:space="preserve">0.40</w:t>
-            </w:r>
-          </w:p>
-        </w:tc>
-        <w:tc>
-          <w:tcPr>
-            <w:tcW w:type="dxa" w:w="1500"/>
-            <w:tcBorders>
-              <w:top w:val="none" w:color="FFFFFF" w:sz="0"/>
-              <w:left w:val="none" w:color="FFFFFF" w:sz="0"/>
-              <w:bottom w:val="none" w:color="FFFFFF" w:sz="0"/>
-              <w:right w:val="none" w:color="FFFFFF" w:sz="0"/>
-            </w:tcBorders>
-            <w:tcMar>
-              <w:top w:type="dxa" w:w="50"/>
-              <w:left w:type="dxa" w:w="70"/>
-              <w:bottom w:type="dxa" w:w="50"/>
-              <w:right w:type="dxa" w:w="70"/>
-            </w:tcMar>
-          </w:tcPr>
-          <w:p>
-            <w:pPr>
-              <w:bidi w:val="false"/>
-              <w:spacing w:after="0" w:line="276"/>
-              <w:jc w:val="center"/>
-            </w:pPr>
-            <w:r>
-              <w:rPr>
-                <w:rFonts w:ascii="Times New Roman" w:cs="Times New Roman" w:eastAsia="Times New Roman" w:hAnsi="Times New Roman"/>
-                <w:b w:val="false"/>
-                <w:bCs w:val="false"/>
-                <w:noProof/>
-                <w:sz w:val="22"/>
-                <w:szCs w:val="22"/>
-                <w:lang w:val="en-US" w:bidi="he-IL"/>
-              </w:rPr>
-              <w:t xml:space="preserve">0.69</w:t>
-            </w:r>
-          </w:p>
-        </w:tc>
-        <w:tc>
-          <w:tcPr>
-            <w:tcW w:type="dxa" w:w="1300"/>
-            <w:tcBorders>
-              <w:top w:val="none" w:color="FFFFFF" w:sz="0"/>
-              <w:left w:val="none" w:color="FFFFFF" w:sz="0"/>
-              <w:bottom w:val="none" w:color="FFFFFF" w:sz="0"/>
-              <w:right w:val="none" w:color="FFFFFF" w:sz="0"/>
-            </w:tcBorders>
-            <w:tcMar>
-              <w:top w:type="dxa" w:w="50"/>
-              <w:left w:type="dxa" w:w="70"/>
-              <w:bottom w:type="dxa" w:w="50"/>
-              <w:right w:type="dxa" w:w="70"/>
-            </w:tcMar>
-          </w:tcPr>
-          <w:p>
-            <w:pPr>
-              <w:bidi w:val="false"/>
-              <w:spacing w:after="0" w:line="276"/>
-              <w:jc w:val="center"/>
-            </w:pPr>
-          </w:p>
-        </w:tc>
-      </w:tr>
-      <w:tr>
-        <w:trPr>
-          <w:cantSplit/>
-        </w:trPr>
-        <w:tc>
-          <w:tcPr>
-            <w:tcW w:type="dxa" w:w="3900"/>
-            <w:tcBorders>
-              <w:top w:val="none" w:color="FFFFFF" w:sz="0"/>
-              <w:left w:val="none" w:color="FFFFFF" w:sz="0"/>
-              <w:bottom w:val="none" w:color="FFFFFF" w:sz="0"/>
-              <w:right w:val="none" w:color="FFFFFF" w:sz="0"/>
-            </w:tcBorders>
-            <w:tcMar>
-              <w:top w:type="dxa" w:w="50"/>
-              <w:left w:type="dxa" w:w="70"/>
-              <w:bottom w:type="dxa" w:w="50"/>
-              <w:right w:type="dxa" w:w="70"/>
-            </w:tcMar>
-          </w:tcPr>
-          <w:p>
-            <w:pPr>
-              <w:bidi/>
-              <w:spacing w:after="0" w:line="276"/>
-              <w:jc w:val="right"/>
-            </w:pPr>
-            <w:r>
-              <w:rPr>
-                <w:rFonts w:ascii="David" w:cs="David" w:eastAsia="David" w:hAnsi="David"/>
-                <w:b w:val="false"/>
-                <w:bCs w:val="false"/>
-                <w:sz w:val="22"/>
-                <w:szCs w:val="22"/>
-                <w:rtl/>
-                <w:lang w:val="en-US" w:bidi="he-IL"/>
-              </w:rPr>
-              <w:t xml:space="preserve">רווחה נפשית (</w:t>
-            </w:r>
-            <w:r>
-              <w:rPr>
-                <w:rFonts w:ascii="Times New Roman" w:cs="Times New Roman" w:eastAsia="Times New Roman" w:hAnsi="Times New Roman"/>
-                <w:b w:val="false"/>
-                <w:bCs w:val="false"/>
-                <w:noProof/>
-                <w:sz w:val="22"/>
-                <w:szCs w:val="22"/>
-                <w:lang w:val="en-US" w:bidi="he-IL"/>
-              </w:rPr>
-              <w:t xml:space="preserve">5</w:t>
-            </w:r>
-            <w:r>
-              <w:rPr>
-                <w:rFonts w:ascii="David" w:cs="David" w:eastAsia="David" w:hAnsi="David"/>
-                <w:b w:val="false"/>
-                <w:bCs w:val="false"/>
-                <w:sz w:val="22"/>
-                <w:szCs w:val="22"/>
-                <w:rtl/>
-                <w:lang w:val="en-US" w:bidi="he-IL"/>
-              </w:rPr>
-              <w:t xml:space="preserve"> פריטים, </w:t>
-            </w:r>
-            <w:r>
-              <w:rPr>
-                <w:rFonts w:ascii="Times New Roman" w:cs="Times New Roman" w:eastAsia="Times New Roman" w:hAnsi="Times New Roman"/>
-                <w:b w:val="false"/>
-                <w:bCs w:val="false"/>
-                <w:noProof/>
-                <w:sz w:val="22"/>
-                <w:szCs w:val="22"/>
-                <w:lang w:val="en-US" w:bidi="he-IL"/>
-              </w:rPr>
-              <w:t xml:space="preserve">n = 2,379</w:t>
-            </w:r>
-            <w:r>
-              <w:rPr>
-                <w:rFonts w:ascii="David" w:cs="David" w:eastAsia="David" w:hAnsi="David"/>
-                <w:b w:val="false"/>
-                <w:bCs w:val="false"/>
-                <w:sz w:val="22"/>
-                <w:szCs w:val="22"/>
-                <w:rtl/>
-                <w:lang w:val="en-US" w:bidi="he-IL"/>
-              </w:rPr>
-              <w:t xml:space="preserve">)</w:t>
-            </w:r>
-          </w:p>
-        </w:tc>
-        <w:tc>
-          <w:tcPr>
-            <w:tcW w:type="dxa" w:w="1700"/>
-            <w:tcBorders>
-              <w:top w:val="none" w:color="FFFFFF" w:sz="0"/>
-              <w:left w:val="none" w:color="FFFFFF" w:sz="0"/>
-              <w:bottom w:val="none" w:color="FFFFFF" w:sz="0"/>
-              <w:right w:val="none" w:color="FFFFFF" w:sz="0"/>
-            </w:tcBorders>
-            <w:tcMar>
-              <w:top w:type="dxa" w:w="50"/>
-              <w:left w:type="dxa" w:w="70"/>
-              <w:bottom w:type="dxa" w:w="50"/>
-              <w:right w:type="dxa" w:w="70"/>
-            </w:tcMar>
-          </w:tcPr>
-          <w:p>
-            <w:pPr>
-              <w:bidi w:val="false"/>
-              <w:spacing w:after="0" w:line="276"/>
-              <w:jc w:val="center"/>
-            </w:pPr>
-          </w:p>
-        </w:tc>
-        <w:tc>
-          <w:tcPr>
-            <w:tcW w:type="dxa" w:w="1500"/>
-            <w:tcBorders>
-              <w:top w:val="none" w:color="FFFFFF" w:sz="0"/>
-              <w:left w:val="none" w:color="FFFFFF" w:sz="0"/>
-              <w:bottom w:val="none" w:color="FFFFFF" w:sz="0"/>
-              <w:right w:val="none" w:color="FFFFFF" w:sz="0"/>
-            </w:tcBorders>
-            <w:tcMar>
-              <w:top w:type="dxa" w:w="50"/>
-              <w:left w:type="dxa" w:w="70"/>
-              <w:bottom w:type="dxa" w:w="50"/>
-              <w:right w:type="dxa" w:w="70"/>
-            </w:tcMar>
-          </w:tcPr>
-          <w:p>
-            <w:pPr>
-              <w:bidi w:val="false"/>
-              <w:spacing w:after="0" w:line="276"/>
-              <w:jc w:val="center"/>
-            </w:pPr>
-          </w:p>
-        </w:tc>
-        <w:tc>
-          <w:tcPr>
-            <w:tcW w:type="dxa" w:w="1300"/>
-            <w:tcBorders>
-              <w:top w:val="none" w:color="FFFFFF" w:sz="0"/>
-              <w:left w:val="none" w:color="FFFFFF" w:sz="0"/>
-              <w:bottom w:val="none" w:color="FFFFFF" w:sz="0"/>
-              <w:right w:val="none" w:color="FFFFFF" w:sz="0"/>
-            </w:tcBorders>
-            <w:tcMar>
-              <w:top w:type="dxa" w:w="50"/>
-              <w:left w:type="dxa" w:w="70"/>
-              <w:bottom w:type="dxa" w:w="50"/>
-              <w:right w:type="dxa" w:w="70"/>
-            </w:tcMar>
-          </w:tcPr>
-          <w:p>
-            <w:pPr>
-              <w:bidi w:val="false"/>
-              <w:spacing w:after="0" w:line="276"/>
-              <w:jc w:val="center"/>
-            </w:pPr>
-            <w:r>
-              <w:rPr>
-                <w:rFonts w:ascii="Times New Roman" w:cs="Times New Roman" w:eastAsia="Times New Roman" w:hAnsi="Times New Roman"/>
-                <w:b w:val="false"/>
-                <w:bCs w:val="false"/>
-                <w:noProof/>
-                <w:sz w:val="22"/>
-                <w:szCs w:val="22"/>
-                <w:lang w:val="en-US" w:bidi="he-IL"/>
-              </w:rPr>
-              <w:t xml:space="preserve">0.81</w:t>
-            </w:r>
-          </w:p>
-        </w:tc>
-      </w:tr>
-      <w:tr>
-        <w:trPr>
-          <w:cantSplit/>
-        </w:trPr>
-        <w:tc>
-          <w:tcPr>
-            <w:tcW w:type="dxa" w:w="3900"/>
-            <w:tcBorders>
-              <w:top w:val="none" w:color="FFFFFF" w:sz="0"/>
-              <w:left w:val="none" w:color="FFFFFF" w:sz="0"/>
-              <w:bottom w:val="none" w:color="FFFFFF" w:sz="0"/>
-              <w:right w:val="none" w:color="FFFFFF" w:sz="0"/>
-            </w:tcBorders>
-            <w:tcMar>
-              <w:top w:type="dxa" w:w="50"/>
-              <w:left w:type="dxa" w:w="70"/>
-              <w:bottom w:type="dxa" w:w="50"/>
-              <w:right w:type="dxa" w:w="70"/>
-            </w:tcMar>
-          </w:tcPr>
-          <w:p>
-            <w:pPr>
-              <w:bidi/>
-              <w:spacing w:after="0" w:line="276"/>
-              <w:jc w:val="right"/>
-            </w:pPr>
-            <w:r>
-              <w:rPr>
-                <w:rFonts w:ascii="David" w:cs="David" w:eastAsia="David" w:hAnsi="David"/>
-                <w:b w:val="false"/>
-                <w:bCs w:val="false"/>
-                <w:sz w:val="22"/>
-                <w:szCs w:val="22"/>
-                <w:rtl/>
-                <w:lang w:val="en-US" w:bidi="he-IL"/>
-              </w:rPr>
-              <w:t xml:space="preserve">הבריאות השתפרה מאז המאסר</w:t>
-            </w:r>
-          </w:p>
-        </w:tc>
-        <w:tc>
-          <w:tcPr>
-            <w:tcW w:type="dxa" w:w="1700"/>
-            <w:tcBorders>
-              <w:top w:val="none" w:color="FFFFFF" w:sz="0"/>
-              <w:left w:val="none" w:color="FFFFFF" w:sz="0"/>
-              <w:bottom w:val="none" w:color="FFFFFF" w:sz="0"/>
-              <w:right w:val="none" w:color="FFFFFF" w:sz="0"/>
-            </w:tcBorders>
-            <w:tcMar>
-              <w:top w:type="dxa" w:w="50"/>
-              <w:left w:type="dxa" w:w="70"/>
-              <w:bottom w:type="dxa" w:w="50"/>
-              <w:right w:type="dxa" w:w="70"/>
-            </w:tcMar>
-          </w:tcPr>
-          <w:p>
-            <w:pPr>
-              <w:bidi w:val="false"/>
-              <w:spacing w:after="0" w:line="276"/>
-              <w:jc w:val="center"/>
-            </w:pPr>
-            <w:r>
-              <w:rPr>
-                <w:rFonts w:ascii="Times New Roman" w:cs="Times New Roman" w:eastAsia="Times New Roman" w:hAnsi="Times New Roman"/>
-                <w:b w:val="false"/>
-                <w:bCs w:val="false"/>
-                <w:noProof/>
-                <w:sz w:val="22"/>
-                <w:szCs w:val="22"/>
-                <w:lang w:val="en-US" w:bidi="he-IL"/>
-              </w:rPr>
-              <w:t xml:space="preserve">0.47</w:t>
-            </w:r>
-          </w:p>
-        </w:tc>
-        <w:tc>
-          <w:tcPr>
-            <w:tcW w:type="dxa" w:w="1500"/>
-            <w:tcBorders>
-              <w:top w:val="none" w:color="FFFFFF" w:sz="0"/>
-              <w:left w:val="none" w:color="FFFFFF" w:sz="0"/>
-              <w:bottom w:val="none" w:color="FFFFFF" w:sz="0"/>
-              <w:right w:val="none" w:color="FFFFFF" w:sz="0"/>
-            </w:tcBorders>
-            <w:tcMar>
-              <w:top w:type="dxa" w:w="50"/>
-              <w:left w:type="dxa" w:w="70"/>
-              <w:bottom w:type="dxa" w:w="50"/>
-              <w:right w:type="dxa" w:w="70"/>
-            </w:tcMar>
-          </w:tcPr>
-          <w:p>
-            <w:pPr>
-              <w:bidi w:val="false"/>
-              <w:spacing w:after="0" w:line="276"/>
-              <w:jc w:val="center"/>
-            </w:pPr>
-            <w:r>
-              <w:rPr>
-                <w:rFonts w:ascii="Times New Roman" w:cs="Times New Roman" w:eastAsia="Times New Roman" w:hAnsi="Times New Roman"/>
-                <w:b w:val="false"/>
-                <w:bCs w:val="false"/>
-                <w:noProof/>
-                <w:sz w:val="22"/>
-                <w:szCs w:val="22"/>
-                <w:lang w:val="en-US" w:bidi="he-IL"/>
-              </w:rPr>
-              <w:t xml:space="preserve">0.80</w:t>
-            </w:r>
-          </w:p>
-        </w:tc>
-        <w:tc>
-          <w:tcPr>
-            <w:tcW w:type="dxa" w:w="1300"/>
-            <w:tcBorders>
-              <w:top w:val="none" w:color="FFFFFF" w:sz="0"/>
-              <w:left w:val="none" w:color="FFFFFF" w:sz="0"/>
-              <w:bottom w:val="none" w:color="FFFFFF" w:sz="0"/>
-              <w:right w:val="none" w:color="FFFFFF" w:sz="0"/>
-            </w:tcBorders>
-            <w:tcMar>
-              <w:top w:type="dxa" w:w="50"/>
-              <w:left w:type="dxa" w:w="70"/>
-              <w:bottom w:type="dxa" w:w="50"/>
-              <w:right w:type="dxa" w:w="70"/>
-            </w:tcMar>
-          </w:tcPr>
-          <w:p>
-            <w:pPr>
-              <w:bidi w:val="false"/>
-              <w:spacing w:after="0" w:line="276"/>
-              <w:jc w:val="center"/>
-            </w:pPr>
-          </w:p>
-        </w:tc>
-      </w:tr>
-      <w:tr>
-        <w:trPr>
-          <w:cantSplit/>
-        </w:trPr>
-        <w:tc>
-          <w:tcPr>
-            <w:tcW w:type="dxa" w:w="3900"/>
-            <w:tcBorders>
-              <w:top w:val="none" w:color="FFFFFF" w:sz="0"/>
-              <w:left w:val="none" w:color="FFFFFF" w:sz="0"/>
-              <w:bottom w:val="none" w:color="FFFFFF" w:sz="0"/>
-              <w:right w:val="none" w:color="FFFFFF" w:sz="0"/>
-            </w:tcBorders>
-            <w:tcMar>
-              <w:top w:type="dxa" w:w="50"/>
-              <w:left w:type="dxa" w:w="70"/>
-              <w:bottom w:type="dxa" w:w="50"/>
-              <w:right w:type="dxa" w:w="70"/>
-            </w:tcMar>
-          </w:tcPr>
-          <w:p>
-            <w:pPr>
-              <w:bidi/>
-              <w:spacing w:after="0" w:line="276"/>
-              <w:jc w:val="right"/>
-            </w:pPr>
-            <w:r>
-              <w:rPr>
-                <w:rFonts w:ascii="David" w:cs="David" w:eastAsia="David" w:hAnsi="David"/>
-                <w:b w:val="false"/>
-                <w:bCs w:val="false"/>
-                <w:sz w:val="22"/>
-                <w:szCs w:val="22"/>
-                <w:rtl/>
-                <w:lang w:val="en-US" w:bidi="he-IL"/>
-              </w:rPr>
-              <w:t xml:space="preserve">הבריאות הגופנית טובה</w:t>
-            </w:r>
-          </w:p>
-        </w:tc>
-        <w:tc>
-          <w:tcPr>
-            <w:tcW w:type="dxa" w:w="1700"/>
-            <w:tcBorders>
-              <w:top w:val="none" w:color="FFFFFF" w:sz="0"/>
-              <w:left w:val="none" w:color="FFFFFF" w:sz="0"/>
-              <w:bottom w:val="none" w:color="FFFFFF" w:sz="0"/>
-              <w:right w:val="none" w:color="FFFFFF" w:sz="0"/>
-            </w:tcBorders>
-            <w:tcMar>
-              <w:top w:type="dxa" w:w="50"/>
-              <w:left w:type="dxa" w:w="70"/>
-              <w:bottom w:type="dxa" w:w="50"/>
-              <w:right w:type="dxa" w:w="70"/>
-            </w:tcMar>
-          </w:tcPr>
-          <w:p>
-            <w:pPr>
-              <w:bidi w:val="false"/>
-              <w:spacing w:after="0" w:line="276"/>
-              <w:jc w:val="center"/>
-            </w:pPr>
-            <w:r>
-              <w:rPr>
-                <w:rFonts w:ascii="Times New Roman" w:cs="Times New Roman" w:eastAsia="Times New Roman" w:hAnsi="Times New Roman"/>
-                <w:b w:val="false"/>
-                <w:bCs w:val="false"/>
-                <w:noProof/>
-                <w:sz w:val="22"/>
-                <w:szCs w:val="22"/>
-                <w:lang w:val="en-US" w:bidi="he-IL"/>
-              </w:rPr>
-              <w:t xml:space="preserve">0.63</w:t>
-            </w:r>
-          </w:p>
-        </w:tc>
-        <w:tc>
-          <w:tcPr>
-            <w:tcW w:type="dxa" w:w="1500"/>
-            <w:tcBorders>
-              <w:top w:val="none" w:color="FFFFFF" w:sz="0"/>
-              <w:left w:val="none" w:color="FFFFFF" w:sz="0"/>
-              <w:bottom w:val="none" w:color="FFFFFF" w:sz="0"/>
-              <w:right w:val="none" w:color="FFFFFF" w:sz="0"/>
-            </w:tcBorders>
-            <w:tcMar>
-              <w:top w:type="dxa" w:w="50"/>
-              <w:left w:type="dxa" w:w="70"/>
-              <w:bottom w:type="dxa" w:w="50"/>
-              <w:right w:type="dxa" w:w="70"/>
-            </w:tcMar>
-          </w:tcPr>
-          <w:p>
-            <w:pPr>
-              <w:bidi w:val="false"/>
-              <w:spacing w:after="0" w:line="276"/>
-              <w:jc w:val="center"/>
-            </w:pPr>
-            <w:r>
-              <w:rPr>
-                <w:rFonts w:ascii="Times New Roman" w:cs="Times New Roman" w:eastAsia="Times New Roman" w:hAnsi="Times New Roman"/>
-                <w:b w:val="false"/>
-                <w:bCs w:val="false"/>
-                <w:noProof/>
-                <w:sz w:val="22"/>
-                <w:szCs w:val="22"/>
-                <w:lang w:val="en-US" w:bidi="he-IL"/>
-              </w:rPr>
-              <w:t xml:space="preserve">0.75</w:t>
-            </w:r>
-          </w:p>
-        </w:tc>
-        <w:tc>
-          <w:tcPr>
-            <w:tcW w:type="dxa" w:w="1300"/>
-            <w:tcBorders>
-              <w:top w:val="none" w:color="FFFFFF" w:sz="0"/>
-              <w:left w:val="none" w:color="FFFFFF" w:sz="0"/>
-              <w:bottom w:val="none" w:color="FFFFFF" w:sz="0"/>
-              <w:right w:val="none" w:color="FFFFFF" w:sz="0"/>
-            </w:tcBorders>
-            <w:tcMar>
-              <w:top w:type="dxa" w:w="50"/>
-              <w:left w:type="dxa" w:w="70"/>
-              <w:bottom w:type="dxa" w:w="50"/>
-              <w:right w:type="dxa" w:w="70"/>
-            </w:tcMar>
-          </w:tcPr>
-          <w:p>
-            <w:pPr>
-              <w:bidi w:val="false"/>
-              <w:spacing w:after="0" w:line="276"/>
-              <w:jc w:val="center"/>
-            </w:pPr>
-          </w:p>
-        </w:tc>
-      </w:tr>
-      <w:tr>
-        <w:trPr>
-          <w:cantSplit/>
-        </w:trPr>
-        <w:tc>
-          <w:tcPr>
-            <w:tcW w:type="dxa" w:w="3900"/>
-            <w:tcBorders>
-              <w:top w:val="none" w:color="FFFFFF" w:sz="0"/>
-              <w:left w:val="none" w:color="FFFFFF" w:sz="0"/>
-              <w:bottom w:val="none" w:color="FFFFFF" w:sz="0"/>
-              <w:right w:val="none" w:color="FFFFFF" w:sz="0"/>
-            </w:tcBorders>
-            <w:tcMar>
-              <w:top w:type="dxa" w:w="50"/>
-              <w:left w:type="dxa" w:w="70"/>
-              <w:bottom w:type="dxa" w:w="50"/>
-              <w:right w:type="dxa" w:w="70"/>
-            </w:tcMar>
-          </w:tcPr>
-          <w:p>
-            <w:pPr>
-              <w:bidi/>
-              <w:spacing w:after="0" w:line="276"/>
-              <w:jc w:val="right"/>
-            </w:pPr>
-            <w:r>
-              <w:rPr>
-                <w:rFonts w:ascii="David" w:cs="David" w:eastAsia="David" w:hAnsi="David"/>
-                <w:b w:val="false"/>
-                <w:bCs w:val="false"/>
-                <w:sz w:val="22"/>
-                <w:szCs w:val="22"/>
-                <w:rtl/>
-                <w:lang w:val="en-US" w:bidi="he-IL"/>
-              </w:rPr>
-              <w:t xml:space="preserve">הבריאות הנפשית טובה</w:t>
-            </w:r>
-          </w:p>
-        </w:tc>
-        <w:tc>
-          <w:tcPr>
-            <w:tcW w:type="dxa" w:w="1700"/>
-            <w:tcBorders>
-              <w:top w:val="none" w:color="FFFFFF" w:sz="0"/>
-              <w:left w:val="none" w:color="FFFFFF" w:sz="0"/>
-              <w:bottom w:val="none" w:color="FFFFFF" w:sz="0"/>
-              <w:right w:val="none" w:color="FFFFFF" w:sz="0"/>
-            </w:tcBorders>
-            <w:tcMar>
-              <w:top w:type="dxa" w:w="50"/>
-              <w:left w:type="dxa" w:w="70"/>
-              <w:bottom w:type="dxa" w:w="50"/>
-              <w:right w:type="dxa" w:w="70"/>
-            </w:tcMar>
-          </w:tcPr>
-          <w:p>
-            <w:pPr>
-              <w:bidi w:val="false"/>
-              <w:spacing w:after="0" w:line="276"/>
-              <w:jc w:val="center"/>
-            </w:pPr>
-            <w:r>
-              <w:rPr>
-                <w:rFonts w:ascii="Times New Roman" w:cs="Times New Roman" w:eastAsia="Times New Roman" w:hAnsi="Times New Roman"/>
-                <w:b w:val="false"/>
-                <w:bCs w:val="false"/>
-                <w:noProof/>
-                <w:sz w:val="22"/>
-                <w:szCs w:val="22"/>
-                <w:lang w:val="en-US" w:bidi="he-IL"/>
-              </w:rPr>
-              <w:t xml:space="preserve">0.68</w:t>
-            </w:r>
-          </w:p>
-        </w:tc>
-        <w:tc>
-          <w:tcPr>
-            <w:tcW w:type="dxa" w:w="1500"/>
-            <w:tcBorders>
-              <w:top w:val="none" w:color="FFFFFF" w:sz="0"/>
-              <w:left w:val="none" w:color="FFFFFF" w:sz="0"/>
-              <w:bottom w:val="none" w:color="FFFFFF" w:sz="0"/>
-              <w:right w:val="none" w:color="FFFFFF" w:sz="0"/>
-            </w:tcBorders>
-            <w:tcMar>
-              <w:top w:type="dxa" w:w="50"/>
-              <w:left w:type="dxa" w:w="70"/>
-              <w:bottom w:type="dxa" w:w="50"/>
-              <w:right w:type="dxa" w:w="70"/>
-            </w:tcMar>
-          </w:tcPr>
-          <w:p>
-            <w:pPr>
-              <w:bidi w:val="false"/>
-              <w:spacing w:after="0" w:line="276"/>
-              <w:jc w:val="center"/>
-            </w:pPr>
-            <w:r>
-              <w:rPr>
-                <w:rFonts w:ascii="Times New Roman" w:cs="Times New Roman" w:eastAsia="Times New Roman" w:hAnsi="Times New Roman"/>
-                <w:b w:val="false"/>
-                <w:bCs w:val="false"/>
-                <w:noProof/>
-                <w:sz w:val="22"/>
-                <w:szCs w:val="22"/>
-                <w:lang w:val="en-US" w:bidi="he-IL"/>
-              </w:rPr>
-              <w:t xml:space="preserve">0.74</w:t>
-            </w:r>
-          </w:p>
-        </w:tc>
-        <w:tc>
-          <w:tcPr>
-            <w:tcW w:type="dxa" w:w="1300"/>
-            <w:tcBorders>
-              <w:top w:val="none" w:color="FFFFFF" w:sz="0"/>
-              <w:left w:val="none" w:color="FFFFFF" w:sz="0"/>
-              <w:bottom w:val="none" w:color="FFFFFF" w:sz="0"/>
-              <w:right w:val="none" w:color="FFFFFF" w:sz="0"/>
-            </w:tcBorders>
-            <w:tcMar>
-              <w:top w:type="dxa" w:w="50"/>
-              <w:left w:type="dxa" w:w="70"/>
-              <w:bottom w:type="dxa" w:w="50"/>
-              <w:right w:type="dxa" w:w="70"/>
-            </w:tcMar>
-          </w:tcPr>
-          <w:p>
-            <w:pPr>
-              <w:bidi w:val="false"/>
-              <w:spacing w:after="0" w:line="276"/>
-              <w:jc w:val="center"/>
-            </w:pPr>
-          </w:p>
-        </w:tc>
-      </w:tr>
-      <w:tr>
-        <w:trPr>
-          <w:cantSplit/>
-        </w:trPr>
-        <w:tc>
-          <w:tcPr>
-            <w:tcW w:type="dxa" w:w="3900"/>
-            <w:tcBorders>
-              <w:top w:val="none" w:color="FFFFFF" w:sz="0"/>
-              <w:left w:val="none" w:color="FFFFFF" w:sz="0"/>
-              <w:bottom w:val="none" w:color="FFFFFF" w:sz="0"/>
-              <w:right w:val="none" w:color="FFFFFF" w:sz="0"/>
-            </w:tcBorders>
-            <w:tcMar>
-              <w:top w:type="dxa" w:w="50"/>
-              <w:left w:type="dxa" w:w="70"/>
-              <w:bottom w:type="dxa" w:w="50"/>
-              <w:right w:type="dxa" w:w="70"/>
-            </w:tcMar>
-          </w:tcPr>
-          <w:p>
-            <w:pPr>
-              <w:bidi/>
-              <w:spacing w:after="0" w:line="276"/>
-              <w:jc w:val="right"/>
-            </w:pPr>
-            <w:r>
-              <w:rPr>
-                <w:rFonts w:ascii="David" w:cs="David" w:eastAsia="David" w:hAnsi="David"/>
-                <w:b w:val="false"/>
-                <w:bCs w:val="false"/>
-                <w:sz w:val="22"/>
-                <w:szCs w:val="22"/>
-                <w:rtl/>
-                <w:lang w:val="en-US" w:bidi="he-IL"/>
-              </w:rPr>
-              <w:t xml:space="preserve">תחושת שמחה בחודש האחרון</w:t>
-            </w:r>
-          </w:p>
-        </w:tc>
-        <w:tc>
-          <w:tcPr>
-            <w:tcW w:type="dxa" w:w="1700"/>
-            <w:tcBorders>
-              <w:top w:val="none" w:color="FFFFFF" w:sz="0"/>
-              <w:left w:val="none" w:color="FFFFFF" w:sz="0"/>
-              <w:bottom w:val="none" w:color="FFFFFF" w:sz="0"/>
-              <w:right w:val="none" w:color="FFFFFF" w:sz="0"/>
-            </w:tcBorders>
-            <w:tcMar>
-              <w:top w:type="dxa" w:w="50"/>
-              <w:left w:type="dxa" w:w="70"/>
-              <w:bottom w:type="dxa" w:w="50"/>
-              <w:right w:type="dxa" w:w="70"/>
-            </w:tcMar>
-          </w:tcPr>
-          <w:p>
-            <w:pPr>
-              <w:bidi w:val="false"/>
-              <w:spacing w:after="0" w:line="276"/>
-              <w:jc w:val="center"/>
-            </w:pPr>
-            <w:r>
-              <w:rPr>
-                <w:rFonts w:ascii="Times New Roman" w:cs="Times New Roman" w:eastAsia="Times New Roman" w:hAnsi="Times New Roman"/>
-                <w:b w:val="false"/>
-                <w:bCs w:val="false"/>
-                <w:noProof/>
-                <w:sz w:val="22"/>
-                <w:szCs w:val="22"/>
-                <w:lang w:val="en-US" w:bidi="he-IL"/>
-              </w:rPr>
-              <w:t xml:space="preserve">0.62</w:t>
-            </w:r>
-          </w:p>
-        </w:tc>
-        <w:tc>
-          <w:tcPr>
-            <w:tcW w:type="dxa" w:w="1500"/>
-            <w:tcBorders>
-              <w:top w:val="none" w:color="FFFFFF" w:sz="0"/>
-              <w:left w:val="none" w:color="FFFFFF" w:sz="0"/>
-              <w:bottom w:val="none" w:color="FFFFFF" w:sz="0"/>
-              <w:right w:val="none" w:color="FFFFFF" w:sz="0"/>
-            </w:tcBorders>
-            <w:tcMar>
-              <w:top w:type="dxa" w:w="50"/>
-              <w:left w:type="dxa" w:w="70"/>
-              <w:bottom w:type="dxa" w:w="50"/>
-              <w:right w:type="dxa" w:w="70"/>
-            </w:tcMar>
-          </w:tcPr>
-          <w:p>
-            <w:pPr>
-              <w:bidi w:val="false"/>
-              <w:spacing w:after="0" w:line="276"/>
-              <w:jc w:val="center"/>
-            </w:pPr>
-            <w:r>
-              <w:rPr>
-                <w:rFonts w:ascii="Times New Roman" w:cs="Times New Roman" w:eastAsia="Times New Roman" w:hAnsi="Times New Roman"/>
-                <w:b w:val="false"/>
-                <w:bCs w:val="false"/>
-                <w:noProof/>
-                <w:sz w:val="22"/>
-                <w:szCs w:val="22"/>
-                <w:lang w:val="en-US" w:bidi="he-IL"/>
-              </w:rPr>
-              <w:t xml:space="preserve">0.76</w:t>
-            </w:r>
-          </w:p>
-        </w:tc>
-        <w:tc>
-          <w:tcPr>
-            <w:tcW w:type="dxa" w:w="1300"/>
-            <w:tcBorders>
-              <w:top w:val="none" w:color="FFFFFF" w:sz="0"/>
-              <w:left w:val="none" w:color="FFFFFF" w:sz="0"/>
-              <w:bottom w:val="none" w:color="FFFFFF" w:sz="0"/>
-              <w:right w:val="none" w:color="FFFFFF" w:sz="0"/>
-            </w:tcBorders>
-            <w:tcMar>
-              <w:top w:type="dxa" w:w="50"/>
-              <w:left w:type="dxa" w:w="70"/>
-              <w:bottom w:type="dxa" w:w="50"/>
-              <w:right w:type="dxa" w:w="70"/>
-            </w:tcMar>
-          </w:tcPr>
-          <w:p>
-            <w:pPr>
-              <w:bidi w:val="false"/>
-              <w:spacing w:after="0" w:line="276"/>
-              <w:jc w:val="center"/>
-            </w:pPr>
-          </w:p>
-        </w:tc>
-      </w:tr>
-      <w:tr>
-        <w:trPr>
-          <w:cantSplit/>
-        </w:trPr>
-        <w:tc>
-          <w:tcPr>
-            <w:tcW w:type="dxa" w:w="3900"/>
-            <w:tcBorders>
-              <w:top w:val="none" w:color="FFFFFF" w:sz="0"/>
-              <w:left w:val="none" w:color="FFFFFF" w:sz="0"/>
-              <w:bottom w:val="none" w:color="FFFFFF" w:sz="0"/>
-              <w:right w:val="none" w:color="FFFFFF" w:sz="0"/>
-            </w:tcBorders>
-            <w:tcMar>
-              <w:top w:type="dxa" w:w="50"/>
-              <w:left w:type="dxa" w:w="70"/>
-              <w:bottom w:type="dxa" w:w="50"/>
-              <w:right w:type="dxa" w:w="70"/>
-            </w:tcMar>
-          </w:tcPr>
-          <w:p>
-            <w:pPr>
-              <w:bidi/>
-              <w:spacing w:after="0" w:line="276"/>
-              <w:jc w:val="right"/>
-            </w:pPr>
-            <w:r>
-              <w:rPr>
-                <w:rFonts w:ascii="David" w:cs="David" w:eastAsia="David" w:hAnsi="David"/>
-                <w:b w:val="false"/>
-                <w:bCs w:val="false"/>
-                <w:sz w:val="22"/>
-                <w:szCs w:val="22"/>
-                <w:rtl/>
-                <w:lang w:val="en-US" w:bidi="he-IL"/>
-              </w:rPr>
-              <w:t xml:space="preserve">שביעות רצון מהחיים בחודש האחרון</w:t>
-            </w:r>
-          </w:p>
-        </w:tc>
-        <w:tc>
-          <w:tcPr>
-            <w:tcW w:type="dxa" w:w="1700"/>
-            <w:tcBorders>
-              <w:top w:val="none" w:color="FFFFFF" w:sz="0"/>
-              <w:left w:val="none" w:color="FFFFFF" w:sz="0"/>
-              <w:bottom w:val="none" w:color="FFFFFF" w:sz="0"/>
-              <w:right w:val="none" w:color="FFFFFF" w:sz="0"/>
-            </w:tcBorders>
-            <w:tcMar>
-              <w:top w:type="dxa" w:w="50"/>
-              <w:left w:type="dxa" w:w="70"/>
-              <w:bottom w:type="dxa" w:w="50"/>
-              <w:right w:type="dxa" w:w="70"/>
-            </w:tcMar>
-          </w:tcPr>
-          <w:p>
-            <w:pPr>
-              <w:bidi w:val="false"/>
-              <w:spacing w:after="0" w:line="276"/>
-              <w:jc w:val="center"/>
-            </w:pPr>
-            <w:r>
-              <w:rPr>
-                <w:rFonts w:ascii="Times New Roman" w:cs="Times New Roman" w:eastAsia="Times New Roman" w:hAnsi="Times New Roman"/>
-                <w:b w:val="false"/>
-                <w:bCs w:val="false"/>
-                <w:noProof/>
-                <w:sz w:val="22"/>
-                <w:szCs w:val="22"/>
-                <w:lang w:val="en-US" w:bidi="he-IL"/>
-              </w:rPr>
-              <w:t xml:space="preserve">0.54</w:t>
-            </w:r>
-          </w:p>
-        </w:tc>
-        <w:tc>
-          <w:tcPr>
-            <w:tcW w:type="dxa" w:w="1500"/>
-            <w:tcBorders>
-              <w:top w:val="none" w:color="FFFFFF" w:sz="0"/>
-              <w:left w:val="none" w:color="FFFFFF" w:sz="0"/>
-              <w:bottom w:val="none" w:color="FFFFFF" w:sz="0"/>
-              <w:right w:val="none" w:color="FFFFFF" w:sz="0"/>
-            </w:tcBorders>
-            <w:tcMar>
-              <w:top w:type="dxa" w:w="50"/>
-              <w:left w:type="dxa" w:w="70"/>
-              <w:bottom w:type="dxa" w:w="50"/>
-              <w:right w:type="dxa" w:w="70"/>
-            </w:tcMar>
-          </w:tcPr>
-          <w:p>
-            <w:pPr>
-              <w:bidi w:val="false"/>
-              <w:spacing w:after="0" w:line="276"/>
-              <w:jc w:val="center"/>
-            </w:pPr>
-            <w:r>
-              <w:rPr>
-                <w:rFonts w:ascii="Times New Roman" w:cs="Times New Roman" w:eastAsia="Times New Roman" w:hAnsi="Times New Roman"/>
-                <w:b w:val="false"/>
-                <w:bCs w:val="false"/>
-                <w:noProof/>
-                <w:sz w:val="22"/>
-                <w:szCs w:val="22"/>
-                <w:lang w:val="en-US" w:bidi="he-IL"/>
-              </w:rPr>
-              <w:t xml:space="preserve">0.78</w:t>
-            </w:r>
-          </w:p>
-        </w:tc>
-        <w:tc>
-          <w:tcPr>
-            <w:tcW w:type="dxa" w:w="1300"/>
-            <w:tcBorders>
-              <w:top w:val="none" w:color="FFFFFF" w:sz="0"/>
-              <w:left w:val="none" w:color="FFFFFF" w:sz="0"/>
-              <w:bottom w:val="none" w:color="FFFFFF" w:sz="0"/>
-              <w:right w:val="none" w:color="FFFFFF" w:sz="0"/>
-            </w:tcBorders>
-            <w:tcMar>
-              <w:top w:type="dxa" w:w="50"/>
-              <w:left w:type="dxa" w:w="70"/>
-              <w:bottom w:type="dxa" w:w="50"/>
-              <w:right w:type="dxa" w:w="70"/>
-            </w:tcMar>
-          </w:tcPr>
-          <w:p>
-            <w:pPr>
-              <w:bidi w:val="false"/>
-              <w:spacing w:after="0" w:line="276"/>
-              <w:jc w:val="center"/>
-            </w:pPr>
-          </w:p>
-        </w:tc>
-      </w:tr>
-    </w:tbl>
-    <w:p>
-      <w:pPr>
-        <w:bidi/>
-        <w:spacing w:after="200" w:before="60" w:line="276"/>
-        <w:jc w:val="right"/>
-      </w:pPr>
-      <w:r>
-        <w:rPr>
-          <w:rFonts w:ascii="David" w:cs="David" w:eastAsia="David" w:hAnsi="David"/>
-          <w:sz w:val="20"/>
-          <w:szCs w:val="20"/>
-          <w:rtl/>
-          <w:lang w:val="en-US" w:bidi="he-IL"/>
-        </w:rPr>
-        <w:t xml:space="preserve">הערה. מתאמים בין פריטי הלגיטימיות: </w:t>
-      </w:r>
-      <w:r>
-        <w:rPr>
-          <w:rFonts w:ascii="Times New Roman" w:cs="Times New Roman" w:eastAsia="Times New Roman" w:hAnsi="Times New Roman"/>
-          <w:noProof/>
-          <w:sz w:val="20"/>
-          <w:szCs w:val="20"/>
+        <w:t xml:space="preserve">סולם הרווחה הנפשית מורכב מחמישה פריטים: השיפור בבריאות מאז המאסר, הבריאות הגופנית, הבריאות הנפשית, תחושת השמחה בחודש האחרון ושביעות הרצון מהחיים בחודש האחרון. הסולם מהימן (α = </w:t>
+      </w:r>
+      <w:r>
+        <w:rPr>
+          <w:rFonts w:ascii="Times New Roman" w:cs="Times New Roman" w:eastAsia="Times New Roman" w:hAnsi="Times New Roman"/>
+          <w:noProof/>
+          <w:sz w:val="24"/>
+          <w:szCs w:val="24"/>
+          <w:lang w:val="en-US" w:bidi="he-IL"/>
+        </w:rPr>
+        <w:t xml:space="preserve">0.81</w:t>
+      </w:r>
+      <w:r>
+        <w:rPr>
+          <w:rFonts w:ascii="David" w:cs="David" w:eastAsia="David" w:hAnsi="David"/>
+          <w:sz w:val="24"/>
+          <w:szCs w:val="24"/>
+          <w:rtl/>
+          <w:lang w:val="en-US" w:bidi="he-IL"/>
+        </w:rPr>
+        <w:t xml:space="preserve">), וכל פריט תורם לו: מתאמי הפריט עם יתר הסולם נעים בין </w:t>
+      </w:r>
+      <w:r>
+        <w:rPr>
+          <w:rFonts w:ascii="Times New Roman" w:cs="Times New Roman" w:eastAsia="Times New Roman" w:hAnsi="Times New Roman"/>
+          <w:noProof/>
+          <w:sz w:val="24"/>
+          <w:szCs w:val="24"/>
+          <w:lang w:val="en-US" w:bidi="he-IL"/>
+        </w:rPr>
+        <w:t xml:space="preserve">0.47</w:t>
+      </w:r>
+      <w:r>
+        <w:rPr>
+          <w:rFonts w:ascii="David" w:cs="David" w:eastAsia="David" w:hAnsi="David"/>
+          <w:sz w:val="24"/>
+          <w:szCs w:val="24"/>
+          <w:rtl/>
+          <w:lang w:val="en-US" w:bidi="he-IL"/>
+        </w:rPr>
+        <w:t xml:space="preserve"> ל</w:t>
+      </w:r>
+      <w:r>
+        <w:rPr>
+          <w:rFonts w:ascii="Times New Roman" w:cs="Times New Roman" w:eastAsia="Times New Roman" w:hAnsi="Times New Roman"/>
+          <w:noProof/>
+          <w:sz w:val="24"/>
+          <w:szCs w:val="24"/>
+          <w:lang w:val="en-US" w:bidi="he-IL"/>
+        </w:rPr>
+        <w:t xml:space="preserve">-0.68,</w:t>
+      </w:r>
+      <w:r>
+        <w:rPr>
+          <w:rFonts w:ascii="David" w:cs="David" w:eastAsia="David" w:hAnsi="David"/>
+          <w:sz w:val="24"/>
+          <w:szCs w:val="24"/>
+          <w:rtl/>
+          <w:lang w:val="en-US" w:bidi="he-IL"/>
+        </w:rPr>
+        <w:t xml:space="preserve"> והסרת כל אחד מהפריטים הייתה מורידה את המהימנות. סולם הלגיטימיות מורכב משלושה פריטים: האפשרות לדבר עם הסוהרים כשמודאגים או עצובים, היחס המכבד של הסוהרים ושביעות הרצון מהטיפול בבקשות. מהימנות סולם הלגיטימיות (α = </w:t>
+      </w:r>
+      <w:r>
+        <w:rPr>
+          <w:rFonts w:ascii="Times New Roman" w:cs="Times New Roman" w:eastAsia="Times New Roman" w:hAnsi="Times New Roman"/>
+          <w:noProof/>
+          <w:sz w:val="24"/>
+          <w:szCs w:val="24"/>
+          <w:lang w:val="en-US" w:bidi="he-IL"/>
+        </w:rPr>
+        <w:t xml:space="preserve">0.67</w:t>
+      </w:r>
+      <w:r>
+        <w:rPr>
+          <w:rFonts w:ascii="David" w:cs="David" w:eastAsia="David" w:hAnsi="David"/>
+          <w:sz w:val="24"/>
+          <w:szCs w:val="24"/>
+          <w:rtl/>
+          <w:lang w:val="en-US" w:bidi="he-IL"/>
+        </w:rPr>
+        <w:t xml:space="preserve">) נמוכה מעט מהסף המקובל של </w:t>
+      </w:r>
+      <w:r>
+        <w:rPr>
+          <w:rFonts w:ascii="Times New Roman" w:cs="Times New Roman" w:eastAsia="Times New Roman" w:hAnsi="Times New Roman"/>
+          <w:noProof/>
+          <w:sz w:val="24"/>
+          <w:szCs w:val="24"/>
+          <w:lang w:val="en-US" w:bidi="he-IL"/>
+        </w:rPr>
+        <w:t xml:space="preserve">0.70,</w:t>
+      </w:r>
+      <w:r>
+        <w:rPr>
+          <w:rFonts w:ascii="David" w:cs="David" w:eastAsia="David" w:hAnsi="David"/>
+          <w:sz w:val="24"/>
+          <w:szCs w:val="24"/>
+          <w:rtl/>
+          <w:lang w:val="en-US" w:bidi="he-IL"/>
+        </w:rPr>
+        <w:t xml:space="preserve"> אך זהה למהימנות שדווחה לקובץ הסינתטי וקרובה ל</w:t>
+      </w:r>
+      <w:r>
+        <w:rPr>
+          <w:rFonts w:ascii="Times New Roman" w:cs="Times New Roman" w:eastAsia="Times New Roman" w:hAnsi="Times New Roman"/>
+          <w:noProof/>
+          <w:sz w:val="24"/>
+          <w:szCs w:val="24"/>
+          <w:lang w:val="en-US" w:bidi="he-IL"/>
+        </w:rPr>
+        <w:t xml:space="preserve">-0.72</w:t>
+      </w:r>
+      <w:r>
+        <w:rPr>
+          <w:rFonts w:ascii="David" w:cs="David" w:eastAsia="David" w:hAnsi="David"/>
+          <w:sz w:val="24"/>
+          <w:szCs w:val="24"/>
+          <w:rtl/>
+          <w:lang w:val="en-US" w:bidi="he-IL"/>
+        </w:rPr>
+        <w:t xml:space="preserve"> שנמצאה בסקר המקורי (</w:t>
+      </w:r>
+      <w:r>
+        <w:rPr>
+          <w:rFonts w:ascii="David" w:cs="David" w:eastAsia="David" w:hAnsi="David"/>
+          <w:noProof/>
+          <w:sz w:val="24"/>
+          <w:szCs w:val="24"/>
+          <w:rtl/>
+          <w:lang w:val="en-US" w:bidi="he-IL"/>
+        </w:rPr>
+        <w:t xml:space="preserve">ועקנין</w:t>
+      </w:r>
+      <w:r>
+        <w:rPr>
+          <w:rFonts w:ascii="David" w:cs="David" w:eastAsia="David" w:hAnsi="David"/>
+          <w:sz w:val="24"/>
+          <w:szCs w:val="24"/>
+          <w:rtl/>
+          <w:lang w:val="en-US" w:bidi="he-IL"/>
+        </w:rPr>
+        <w:t xml:space="preserve">, </w:t>
+      </w:r>
+      <w:r>
+        <w:rPr>
+          <w:rFonts w:ascii="Times New Roman" w:cs="Times New Roman" w:eastAsia="Times New Roman" w:hAnsi="Times New Roman"/>
+          <w:noProof/>
+          <w:sz w:val="24"/>
+          <w:szCs w:val="24"/>
+          <w:lang w:val="en-US" w:bidi="he-IL"/>
+        </w:rPr>
+        <w:t xml:space="preserve">2024</w:t>
+      </w:r>
+      <w:r>
+        <w:rPr>
+          <w:rFonts w:ascii="David" w:cs="David" w:eastAsia="David" w:hAnsi="David"/>
+          <w:sz w:val="24"/>
+          <w:szCs w:val="24"/>
+          <w:rtl/>
+          <w:lang w:val="en-US" w:bidi="he-IL"/>
+        </w:rPr>
+        <w:t xml:space="preserve">; י' </w:t>
+      </w:r>
+      <w:r>
+        <w:rPr>
+          <w:rFonts w:ascii="David" w:cs="David" w:eastAsia="David" w:hAnsi="David"/>
+          <w:noProof/>
+          <w:sz w:val="24"/>
+          <w:szCs w:val="24"/>
+          <w:rtl/>
+          <w:lang w:val="en-US" w:bidi="he-IL"/>
+        </w:rPr>
+        <w:t xml:space="preserve">ועקנין</w:t>
+      </w:r>
+      <w:r>
+        <w:rPr>
+          <w:rFonts w:ascii="David" w:cs="David" w:eastAsia="David" w:hAnsi="David"/>
+          <w:sz w:val="24"/>
+          <w:szCs w:val="24"/>
+          <w:rtl/>
+          <w:lang w:val="en-US" w:bidi="he-IL"/>
+        </w:rPr>
+        <w:t xml:space="preserve">, חומרי הקורס, יולי </w:t>
+      </w:r>
+      <w:r>
+        <w:rPr>
+          <w:rFonts w:ascii="Times New Roman" w:cs="Times New Roman" w:eastAsia="Times New Roman" w:hAnsi="Times New Roman"/>
+          <w:noProof/>
+          <w:sz w:val="24"/>
+          <w:szCs w:val="24"/>
+          <w:lang w:val="en-US" w:bidi="he-IL"/>
+        </w:rPr>
+        <w:t xml:space="preserve">2026</w:t>
+      </w:r>
+      <w:r>
+        <w:rPr>
+          <w:rFonts w:ascii="David" w:cs="David" w:eastAsia="David" w:hAnsi="David"/>
+          <w:sz w:val="24"/>
+          <w:szCs w:val="24"/>
+          <w:rtl/>
+          <w:lang w:val="en-US" w:bidi="he-IL"/>
+        </w:rPr>
+        <w:t xml:space="preserve">). לסולם שלושה פריטים בלבד, ומקדם אלפא רגיש למספר הפריטים. שני הפריטים העוסקים ביחס הישיר של הסוהרים, האפשרות לדבר עימם והיחס המכבד, קשורים זה לזה בחוזקה (</w:t>
+      </w:r>
+      <w:r>
+        <w:rPr>
+          <w:rFonts w:ascii="Times New Roman" w:cs="Times New Roman" w:eastAsia="Times New Roman" w:hAnsi="Times New Roman"/>
+          <w:noProof/>
+          <w:sz w:val="24"/>
+          <w:szCs w:val="24"/>
           <w:lang w:val="en-US" w:bidi="he-IL"/>
         </w:rPr>
         <w:t xml:space="preserve">0.55</w:t>
@@ -12759,19 +11205,19 @@
       <w:r>
         <w:rPr>
           <w:rFonts w:ascii="David" w:cs="David" w:eastAsia="David" w:hAnsi="David"/>
-          <w:sz w:val="20"/>
-          <w:szCs w:val="20"/>
-          <w:rtl/>
-          <w:lang w:val="en-US" w:bidi="he-IL"/>
-        </w:rPr>
-        <w:t xml:space="preserve"> (דיבור עם סוהרים וכבוד), </w:t>
-      </w:r>
-      <w:r>
-        <w:rPr>
-          <w:rFonts w:ascii="Times New Roman" w:cs="Times New Roman" w:eastAsia="Times New Roman" w:hAnsi="Times New Roman"/>
-          <w:noProof/>
-          <w:sz w:val="20"/>
-          <w:szCs w:val="20"/>
+          <w:sz w:val="24"/>
+          <w:szCs w:val="24"/>
+          <w:rtl/>
+          <w:lang w:val="en-US" w:bidi="he-IL"/>
+        </w:rPr>
+        <w:t xml:space="preserve">), ואילו פריט הטיפול בבקשות קשור אליהם פחות (</w:t>
+      </w:r>
+      <w:r>
+        <w:rPr>
+          <w:rFonts w:ascii="Times New Roman" w:cs="Times New Roman" w:eastAsia="Times New Roman" w:hAnsi="Times New Roman"/>
+          <w:noProof/>
+          <w:sz w:val="24"/>
+          <w:szCs w:val="24"/>
           <w:lang w:val="en-US" w:bidi="he-IL"/>
         </w:rPr>
         <w:t xml:space="preserve">0.33</w:t>
@@ -12779,271 +11225,32 @@
       <w:r>
         <w:rPr>
           <w:rFonts w:ascii="David" w:cs="David" w:eastAsia="David" w:hAnsi="David"/>
-          <w:sz w:val="20"/>
-          <w:szCs w:val="20"/>
-          <w:rtl/>
-          <w:lang w:val="en-US" w:bidi="he-IL"/>
-        </w:rPr>
-        <w:t xml:space="preserve"> (דיבור ובקשות), </w:t>
-      </w:r>
-      <w:r>
-        <w:rPr>
-          <w:rFonts w:ascii="Times New Roman" w:cs="Times New Roman" w:eastAsia="Times New Roman" w:hAnsi="Times New Roman"/>
-          <w:noProof/>
-          <w:sz w:val="20"/>
-          <w:szCs w:val="20"/>
-          <w:lang w:val="en-US" w:bidi="he-IL"/>
-        </w:rPr>
-        <w:t xml:space="preserve">0.37</w:t>
-      </w:r>
-      <w:r>
-        <w:rPr>
-          <w:rFonts w:ascii="David" w:cs="David" w:eastAsia="David" w:hAnsi="David"/>
-          <w:sz w:val="20"/>
-          <w:szCs w:val="20"/>
-          <w:rtl/>
-          <w:lang w:val="en-US" w:bidi="he-IL"/>
-        </w:rPr>
-        <w:t xml:space="preserve"> (כבוד ובקשות). מקור: פלט </w:t>
-      </w:r>
-      <w:r>
-        <w:rPr>
-          <w:rFonts w:ascii="Times New Roman" w:cs="Times New Roman" w:eastAsia="Times New Roman" w:hAnsi="Times New Roman"/>
-          <w:noProof/>
-          <w:sz w:val="20"/>
-          <w:szCs w:val="20"/>
-          <w:lang w:val="en-US" w:bidi="he-IL"/>
-        </w:rPr>
-        <w:t xml:space="preserve">Reliability</w:t>
-      </w:r>
-      <w:r>
-        <w:rPr>
-          <w:rFonts w:ascii="David" w:cs="David" w:eastAsia="David" w:hAnsi="David"/>
-          <w:sz w:val="20"/>
-          <w:szCs w:val="20"/>
-          <w:rtl/>
-          <w:lang w:val="en-US" w:bidi="he-IL"/>
-        </w:rPr>
-        <w:t xml:space="preserve">, נספח א'.</w:t>
-      </w:r>
-    </w:p>
-    <w:p>
-      <w:pPr>
-        <w:bidi/>
-        <w:spacing w:after="120" w:line="360"/>
-        <w:jc w:val="both"/>
-      </w:pPr>
-      <w:r>
-        <w:rPr>
-          <w:rFonts w:ascii="David" w:cs="David" w:eastAsia="David" w:hAnsi="David"/>
-          <w:sz w:val="24"/>
-          <w:szCs w:val="24"/>
-          <w:rtl/>
-          <w:lang w:val="en-US" w:bidi="he-IL"/>
-        </w:rPr>
-        <w:t xml:space="preserve">מלוח </w:t>
-      </w:r>
-      <w:r>
-        <w:rPr>
-          <w:rFonts w:ascii="Times New Roman" w:cs="Times New Roman" w:eastAsia="Times New Roman" w:hAnsi="Times New Roman"/>
-          <w:noProof/>
-          <w:sz w:val="24"/>
-          <w:szCs w:val="24"/>
-          <w:lang w:val="en-US" w:bidi="he-IL"/>
-        </w:rPr>
-        <w:t xml:space="preserve">4</w:t>
-      </w:r>
-      <w:r>
-        <w:rPr>
-          <w:rFonts w:ascii="David" w:cs="David" w:eastAsia="David" w:hAnsi="David"/>
-          <w:sz w:val="24"/>
-          <w:szCs w:val="24"/>
-          <w:rtl/>
-          <w:lang w:val="en-US" w:bidi="he-IL"/>
-        </w:rPr>
-        <w:t xml:space="preserve"> ניתן ללמוד כי סולם הרווחה הנפשית מהימן (α = </w:t>
-      </w:r>
-      <w:r>
-        <w:rPr>
-          <w:rFonts w:ascii="Times New Roman" w:cs="Times New Roman" w:eastAsia="Times New Roman" w:hAnsi="Times New Roman"/>
-          <w:noProof/>
-          <w:sz w:val="24"/>
-          <w:szCs w:val="24"/>
-          <w:lang w:val="en-US" w:bidi="he-IL"/>
-        </w:rPr>
-        <w:t xml:space="preserve">0.81</w:t>
-      </w:r>
-      <w:r>
-        <w:rPr>
-          <w:rFonts w:ascii="David" w:cs="David" w:eastAsia="David" w:hAnsi="David"/>
-          <w:sz w:val="24"/>
-          <w:szCs w:val="24"/>
-          <w:rtl/>
-          <w:lang w:val="en-US" w:bidi="he-IL"/>
-        </w:rPr>
-        <w:t xml:space="preserve">), וכל פריט תורם לו: הסרת כל אחד מהפריטים הייתה מורידה את המהימנות. מהימנות סולם הלגיטימיות (α = </w:t>
-      </w:r>
-      <w:r>
-        <w:rPr>
-          <w:rFonts w:ascii="Times New Roman" w:cs="Times New Roman" w:eastAsia="Times New Roman" w:hAnsi="Times New Roman"/>
-          <w:noProof/>
-          <w:sz w:val="24"/>
-          <w:szCs w:val="24"/>
-          <w:lang w:val="en-US" w:bidi="he-IL"/>
-        </w:rPr>
-        <w:t xml:space="preserve">0.67</w:t>
-      </w:r>
-      <w:r>
-        <w:rPr>
-          <w:rFonts w:ascii="David" w:cs="David" w:eastAsia="David" w:hAnsi="David"/>
-          <w:sz w:val="24"/>
-          <w:szCs w:val="24"/>
-          <w:rtl/>
-          <w:lang w:val="en-US" w:bidi="he-IL"/>
-        </w:rPr>
-        <w:t xml:space="preserve">) נמוכה מעט מהסף המקובל של </w:t>
-      </w:r>
-      <w:r>
-        <w:rPr>
-          <w:rFonts w:ascii="Times New Roman" w:cs="Times New Roman" w:eastAsia="Times New Roman" w:hAnsi="Times New Roman"/>
-          <w:noProof/>
-          <w:sz w:val="24"/>
-          <w:szCs w:val="24"/>
-          <w:lang w:val="en-US" w:bidi="he-IL"/>
-        </w:rPr>
-        <w:t xml:space="preserve">0.70,</w:t>
-      </w:r>
-      <w:r>
-        <w:rPr>
-          <w:rFonts w:ascii="David" w:cs="David" w:eastAsia="David" w:hAnsi="David"/>
-          <w:sz w:val="24"/>
-          <w:szCs w:val="24"/>
-          <w:rtl/>
-          <w:lang w:val="en-US" w:bidi="he-IL"/>
-        </w:rPr>
-        <w:t xml:space="preserve"> אך זהה למהימנות שדווחה לקובץ הסינתטי וקרובה ל</w:t>
-      </w:r>
-      <w:r>
-        <w:rPr>
-          <w:rFonts w:ascii="Times New Roman" w:cs="Times New Roman" w:eastAsia="Times New Roman" w:hAnsi="Times New Roman"/>
-          <w:noProof/>
-          <w:sz w:val="24"/>
-          <w:szCs w:val="24"/>
-          <w:lang w:val="en-US" w:bidi="he-IL"/>
-        </w:rPr>
-        <w:t xml:space="preserve">-0.72</w:t>
-      </w:r>
-      <w:r>
-        <w:rPr>
-          <w:rFonts w:ascii="David" w:cs="David" w:eastAsia="David" w:hAnsi="David"/>
-          <w:sz w:val="24"/>
-          <w:szCs w:val="24"/>
-          <w:rtl/>
-          <w:lang w:val="en-US" w:bidi="he-IL"/>
-        </w:rPr>
-        <w:t xml:space="preserve"> שנמצאה בסקר המקורי (</w:t>
-      </w:r>
-      <w:r>
-        <w:rPr>
-          <w:rFonts w:ascii="David" w:cs="David" w:eastAsia="David" w:hAnsi="David"/>
-          <w:noProof/>
-          <w:sz w:val="24"/>
-          <w:szCs w:val="24"/>
-          <w:rtl/>
-          <w:lang w:val="en-US" w:bidi="he-IL"/>
-        </w:rPr>
-        <w:t xml:space="preserve">ועקנין</w:t>
-      </w:r>
-      <w:r>
-        <w:rPr>
-          <w:rFonts w:ascii="David" w:cs="David" w:eastAsia="David" w:hAnsi="David"/>
-          <w:sz w:val="24"/>
-          <w:szCs w:val="24"/>
-          <w:rtl/>
-          <w:lang w:val="en-US" w:bidi="he-IL"/>
-        </w:rPr>
-        <w:t xml:space="preserve">, </w:t>
-      </w:r>
-      <w:r>
-        <w:rPr>
-          <w:rFonts w:ascii="Times New Roman" w:cs="Times New Roman" w:eastAsia="Times New Roman" w:hAnsi="Times New Roman"/>
-          <w:noProof/>
-          <w:sz w:val="24"/>
-          <w:szCs w:val="24"/>
-          <w:lang w:val="en-US" w:bidi="he-IL"/>
-        </w:rPr>
-        <w:t xml:space="preserve">2024</w:t>
-      </w:r>
-      <w:r>
-        <w:rPr>
-          <w:rFonts w:ascii="David" w:cs="David" w:eastAsia="David" w:hAnsi="David"/>
-          <w:sz w:val="24"/>
-          <w:szCs w:val="24"/>
-          <w:rtl/>
-          <w:lang w:val="en-US" w:bidi="he-IL"/>
-        </w:rPr>
-        <w:t xml:space="preserve">; י' </w:t>
-      </w:r>
-      <w:r>
-        <w:rPr>
-          <w:rFonts w:ascii="David" w:cs="David" w:eastAsia="David" w:hAnsi="David"/>
-          <w:noProof/>
-          <w:sz w:val="24"/>
-          <w:szCs w:val="24"/>
-          <w:rtl/>
-          <w:lang w:val="en-US" w:bidi="he-IL"/>
-        </w:rPr>
-        <w:t xml:space="preserve">ועקנין</w:t>
-      </w:r>
-      <w:r>
-        <w:rPr>
-          <w:rFonts w:ascii="David" w:cs="David" w:eastAsia="David" w:hAnsi="David"/>
-          <w:sz w:val="24"/>
-          <w:szCs w:val="24"/>
-          <w:rtl/>
-          <w:lang w:val="en-US" w:bidi="he-IL"/>
-        </w:rPr>
-        <w:t xml:space="preserve">, חומרי הקורס, יולי </w:t>
-      </w:r>
-      <w:r>
-        <w:rPr>
-          <w:rFonts w:ascii="Times New Roman" w:cs="Times New Roman" w:eastAsia="Times New Roman" w:hAnsi="Times New Roman"/>
-          <w:noProof/>
-          <w:sz w:val="24"/>
-          <w:szCs w:val="24"/>
-          <w:lang w:val="en-US" w:bidi="he-IL"/>
-        </w:rPr>
-        <w:t xml:space="preserve">2026</w:t>
-      </w:r>
-      <w:r>
-        <w:rPr>
-          <w:rFonts w:ascii="David" w:cs="David" w:eastAsia="David" w:hAnsi="David"/>
-          <w:sz w:val="24"/>
-          <w:szCs w:val="24"/>
-          <w:rtl/>
-          <w:lang w:val="en-US" w:bidi="he-IL"/>
-        </w:rPr>
-        <w:t xml:space="preserve">). לסולם שלושה פריטים בלבד, ומקדם אלפא רגיש למספר הפריטים. שני הפריטים העוסקים ביחס הישיר של הסוהרים, האפשרות לדבר עימם והיחס המכבד, קשורים זה לזה בחוזקה (</w:t>
-      </w:r>
-      <w:r>
-        <w:rPr>
-          <w:rFonts w:ascii="Times New Roman" w:cs="Times New Roman" w:eastAsia="Times New Roman" w:hAnsi="Times New Roman"/>
-          <w:noProof/>
-          <w:sz w:val="24"/>
-          <w:szCs w:val="24"/>
-          <w:lang w:val="en-US" w:bidi="he-IL"/>
-        </w:rPr>
-        <w:t xml:space="preserve">0.55</w:t>
-      </w:r>
-      <w:r>
-        <w:rPr>
-          <w:rFonts w:ascii="David" w:cs="David" w:eastAsia="David" w:hAnsi="David"/>
-          <w:sz w:val="24"/>
-          <w:szCs w:val="24"/>
-          <w:rtl/>
-          <w:lang w:val="en-US" w:bidi="he-IL"/>
-        </w:rPr>
-        <w:t xml:space="preserve">), ואילו פריט הטיפול בבקשות קשור אליהם פחות, והסרתו הייתה מעלה את מקדם אלפא ל</w:t>
+          <w:sz w:val="24"/>
+          <w:szCs w:val="24"/>
+          <w:rtl/>
+          <w:lang w:val="en-US" w:bidi="he-IL"/>
+        </w:rPr>
+        <w:t xml:space="preserve"> ו</w:t>
+      </w:r>
+      <w:r>
+        <w:rPr>
+          <w:rFonts w:ascii="Times New Roman" w:cs="Times New Roman" w:eastAsia="Times New Roman" w:hAnsi="Times New Roman"/>
+          <w:noProof/>
+          <w:sz w:val="24"/>
+          <w:szCs w:val="24"/>
+          <w:lang w:val="en-US" w:bidi="he-IL"/>
+        </w:rPr>
+        <w:t xml:space="preserve">-0.37</w:t>
+      </w:r>
+      <w:r>
+        <w:rPr>
+          <w:rFonts w:ascii="David" w:cs="David" w:eastAsia="David" w:hAnsi="David"/>
+          <w:sz w:val="24"/>
+          <w:szCs w:val="24"/>
+          <w:rtl/>
+          <w:lang w:val="en-US" w:bidi="he-IL"/>
+        </w:rPr>
+        <w:t xml:space="preserve">), והסרתו הייתה מעלה את מקדם אלפא ל</w:t>
       </w:r>
       <w:r>
         <w:rPr>
@@ -13173,7 +11380,7 @@
           <w:szCs w:val="24"/>
           <w:lang w:val="en-US" w:bidi="he-IL"/>
         </w:rPr>
-        <w:t xml:space="preserve">5</w:t>
+        <w:t xml:space="preserve">4</w:t>
       </w:r>
       <w:r>
         <w:rPr>
@@ -13215,7 +11422,7 @@
           <w:szCs w:val="24"/>
           <w:lang w:val="en-US" w:bidi="he-IL"/>
         </w:rPr>
-        <w:t xml:space="preserve">5</w:t>
+        <w:t xml:space="preserve">4</w:t>
       </w:r>
       <w:r>
         <w:rPr>
@@ -14223,7 +12430,7 @@
           <w:szCs w:val="24"/>
           <w:lang w:val="en-US" w:bidi="he-IL"/>
         </w:rPr>
-        <w:t xml:space="preserve">5</w:t>
+        <w:t xml:space="preserve">4</w:t>
       </w:r>
       <w:r>
         <w:rPr>
@@ -14507,7 +12714,7 @@
           <w:szCs w:val="24"/>
           <w:lang w:val="en-US" w:bidi="he-IL"/>
         </w:rPr>
-        <w:t xml:space="preserve">6</w:t>
+        <w:t xml:space="preserve">5</w:t>
       </w:r>
       <w:r>
         <w:rPr>
@@ -14549,7 +12756,7 @@
           <w:szCs w:val="24"/>
           <w:lang w:val="en-US" w:bidi="he-IL"/>
         </w:rPr>
-        <w:t xml:space="preserve">6</w:t>
+        <w:t xml:space="preserve">5</w:t>
       </w:r>
       <w:r>
         <w:rPr>
@@ -15441,211 +13648,211 @@
           <w:szCs w:val="24"/>
           <w:lang w:val="en-US" w:bidi="he-IL"/>
         </w:rPr>
+        <w:t xml:space="preserve">5</w:t>
+      </w:r>
+      <w:r>
+        <w:rPr>
+          <w:rFonts w:ascii="David" w:cs="David" w:eastAsia="David" w:hAnsi="David"/>
+          <w:sz w:val="24"/>
+          <w:szCs w:val="24"/>
+          <w:rtl/>
+          <w:lang w:val="en-US" w:bidi="he-IL"/>
+        </w:rPr>
+        <w:t xml:space="preserve"> ניתן ללמוד כי נמצא קשר חיובי מובהק ברמה בינונית בין רווחה נפשית ללגיטימיות </w:t>
+      </w:r>
+      <w:r>
+        <w:rPr>
+          <w:rFonts w:ascii="Times New Roman" w:cs="Times New Roman" w:eastAsia="Times New Roman" w:hAnsi="Times New Roman"/>
+          <w:noProof/>
+          <w:sz w:val="24"/>
+          <w:szCs w:val="24"/>
+          <w:lang w:val="en-US" w:bidi="he-IL"/>
+        </w:rPr>
+        <w:t xml:space="preserve">(r = 0.32, p &lt; 0.001)</w:t>
+      </w:r>
+      <w:r>
+        <w:rPr>
+          <w:rFonts w:ascii="David" w:cs="David" w:eastAsia="David" w:hAnsi="David"/>
+          <w:sz w:val="24"/>
+          <w:szCs w:val="24"/>
+          <w:rtl/>
+          <w:lang w:val="en-US" w:bidi="he-IL"/>
+        </w:rPr>
+        <w:t xml:space="preserve">: ככל שהשפוט מדווח על רווחה נפשית גבוהה יותר, כך הוא מייחס לסגל לגיטימיות גבוהה יותר, ולהפך. מתאם </w:t>
+      </w:r>
+      <w:r>
+        <w:rPr>
+          <w:rFonts w:ascii="David" w:cs="David" w:eastAsia="David" w:hAnsi="David"/>
+          <w:noProof/>
+          <w:sz w:val="24"/>
+          <w:szCs w:val="24"/>
+          <w:rtl/>
+          <w:lang w:val="en-US" w:bidi="he-IL"/>
+        </w:rPr>
+        <w:t xml:space="preserve">ספירמן</w:t>
+      </w:r>
+      <w:r>
+        <w:rPr>
+          <w:rFonts w:ascii="David" w:cs="David" w:eastAsia="David" w:hAnsi="David"/>
+          <w:sz w:val="24"/>
+          <w:szCs w:val="24"/>
+          <w:rtl/>
+          <w:lang w:val="en-US" w:bidi="he-IL"/>
+        </w:rPr>
+        <w:t xml:space="preserve"> (</w:t>
+      </w:r>
+      <w:r>
+        <w:rPr>
+          <w:rFonts w:ascii="Times New Roman" w:cs="Times New Roman" w:eastAsia="Times New Roman" w:hAnsi="Times New Roman"/>
+          <w:noProof/>
+          <w:sz w:val="24"/>
+          <w:szCs w:val="24"/>
+          <w:lang w:val="en-US" w:bidi="he-IL"/>
+        </w:rPr>
+        <w:t xml:space="preserve">0.34</w:t>
+      </w:r>
+      <w:r>
+        <w:rPr>
+          <w:rFonts w:ascii="David" w:cs="David" w:eastAsia="David" w:hAnsi="David"/>
+          <w:sz w:val="24"/>
+          <w:szCs w:val="24"/>
+          <w:rtl/>
+          <w:lang w:val="en-US" w:bidi="he-IL"/>
+        </w:rPr>
+        <w:t xml:space="preserve">) קרוב מאוד למתאם </w:t>
+      </w:r>
+      <w:r>
+        <w:rPr>
+          <w:rFonts w:ascii="David" w:cs="David" w:eastAsia="David" w:hAnsi="David"/>
+          <w:noProof/>
+          <w:sz w:val="24"/>
+          <w:szCs w:val="24"/>
+          <w:rtl/>
+          <w:lang w:val="en-US" w:bidi="he-IL"/>
+        </w:rPr>
+        <w:t xml:space="preserve">פירסון</w:t>
+      </w:r>
+      <w:r>
+        <w:rPr>
+          <w:rFonts w:ascii="David" w:cs="David" w:eastAsia="David" w:hAnsi="David"/>
+          <w:sz w:val="24"/>
+          <w:szCs w:val="24"/>
+          <w:rtl/>
+          <w:lang w:val="en-US" w:bidi="he-IL"/>
+        </w:rPr>
+        <w:t xml:space="preserve">, ומכאן שההטיה בהתפלגות הלגיטימיות אינה מעוותת את התמונה. הקשר קיים בכל שלושת הפריטים, והחזק שבהם הוא האפשרות לדבר עם הסוהרים כשמודאגים או עצובים (</w:t>
+      </w:r>
+      <w:r>
+        <w:rPr>
+          <w:rFonts w:ascii="Times New Roman" w:cs="Times New Roman" w:eastAsia="Times New Roman" w:hAnsi="Times New Roman"/>
+          <w:noProof/>
+          <w:sz w:val="24"/>
+          <w:szCs w:val="24"/>
+          <w:lang w:val="en-US" w:bidi="he-IL"/>
+        </w:rPr>
+        <w:t xml:space="preserve">0.29</w:t>
+      </w:r>
+      <w:r>
+        <w:rPr>
+          <w:rFonts w:ascii="David" w:cs="David" w:eastAsia="David" w:hAnsi="David"/>
+          <w:sz w:val="24"/>
+          <w:szCs w:val="24"/>
+          <w:rtl/>
+          <w:lang w:val="en-US" w:bidi="he-IL"/>
+        </w:rPr>
+        <w:t xml:space="preserve">). ממצא זה מתיישב עם הדגש של </w:t>
+      </w:r>
+      <w:r>
+        <w:rPr>
+          <w:rFonts w:ascii="David" w:cs="David" w:eastAsia="David" w:hAnsi="David"/>
+          <w:noProof/>
+          <w:sz w:val="24"/>
+          <w:szCs w:val="24"/>
+          <w:rtl/>
+          <w:lang w:val="en-US" w:bidi="he-IL"/>
+        </w:rPr>
+        <w:t xml:space="preserve">ספרקס</w:t>
+      </w:r>
+      <w:r>
+        <w:rPr>
+          <w:rFonts w:ascii="David" w:cs="David" w:eastAsia="David" w:hAnsi="David"/>
+          <w:sz w:val="24"/>
+          <w:szCs w:val="24"/>
+          <w:rtl/>
+          <w:lang w:val="en-US" w:bidi="he-IL"/>
+        </w:rPr>
+        <w:t xml:space="preserve"> </w:t>
+      </w:r>
+      <w:r>
+        <w:rPr>
+          <w:rFonts w:ascii="David" w:cs="David" w:eastAsia="David" w:hAnsi="David"/>
+          <w:noProof/>
+          <w:sz w:val="24"/>
+          <w:szCs w:val="24"/>
+          <w:rtl/>
+          <w:lang w:val="en-US" w:bidi="he-IL"/>
+        </w:rPr>
+        <w:t xml:space="preserve">ובוטומס</w:t>
+      </w:r>
+      <w:r>
+        <w:rPr>
+          <w:rFonts w:ascii="David" w:cs="David" w:eastAsia="David" w:hAnsi="David"/>
+          <w:sz w:val="24"/>
+          <w:szCs w:val="24"/>
+          <w:rtl/>
+          <w:lang w:val="en-US" w:bidi="he-IL"/>
+        </w:rPr>
+        <w:t xml:space="preserve"> (</w:t>
+      </w:r>
+      <w:r>
+        <w:rPr>
+          <w:rFonts w:ascii="Times New Roman" w:cs="Times New Roman" w:eastAsia="Times New Roman" w:hAnsi="Times New Roman"/>
+          <w:noProof/>
+          <w:sz w:val="24"/>
+          <w:szCs w:val="24"/>
+          <w:lang w:val="en-US" w:bidi="he-IL"/>
+        </w:rPr>
+        <w:t xml:space="preserve">1995</w:t>
+      </w:r>
+      <w:r>
+        <w:rPr>
+          <w:rFonts w:ascii="David" w:cs="David" w:eastAsia="David" w:hAnsi="David"/>
+          <w:sz w:val="24"/>
+          <w:szCs w:val="24"/>
+          <w:rtl/>
+          <w:lang w:val="en-US" w:bidi="he-IL"/>
+        </w:rPr>
+        <w:t xml:space="preserve">) על האיכות האנושית של שגרת היום כתנאי ללגיטימיות, ועם הממצא האוסטרלי שלפיו איכות היחסים עם הסגל היא המנגנון שדרכו צדק פרוצדורלי מתורגם לרווחה לאורך זמן </w:t>
+      </w:r>
+      <w:r>
+        <w:rPr>
+          <w:rFonts w:ascii="Times New Roman" w:cs="Times New Roman" w:eastAsia="Times New Roman" w:hAnsi="Times New Roman"/>
+          <w:noProof/>
+          <w:sz w:val="24"/>
+          <w:szCs w:val="24"/>
+          <w:lang w:val="en-US" w:bidi="he-IL"/>
+        </w:rPr>
+        <w:t xml:space="preserve">(Sargeant et al., 2026)</w:t>
+      </w:r>
+      <w:r>
+        <w:rPr>
+          <w:rFonts w:ascii="David" w:cs="David" w:eastAsia="David" w:hAnsi="David"/>
+          <w:sz w:val="24"/>
+          <w:szCs w:val="24"/>
+          <w:rtl/>
+          <w:lang w:val="en-US" w:bidi="he-IL"/>
+        </w:rPr>
+        <w:t xml:space="preserve">. השערת המחקר אוששה. לוח </w:t>
+      </w:r>
+      <w:r>
+        <w:rPr>
+          <w:rFonts w:ascii="Times New Roman" w:cs="Times New Roman" w:eastAsia="Times New Roman" w:hAnsi="Times New Roman"/>
+          <w:noProof/>
+          <w:sz w:val="24"/>
+          <w:szCs w:val="24"/>
+          <w:lang w:val="en-US" w:bidi="he-IL"/>
+        </w:rPr>
         <w:t xml:space="preserve">6</w:t>
-      </w:r>
-      <w:r>
-        <w:rPr>
-          <w:rFonts w:ascii="David" w:cs="David" w:eastAsia="David" w:hAnsi="David"/>
-          <w:sz w:val="24"/>
-          <w:szCs w:val="24"/>
-          <w:rtl/>
-          <w:lang w:val="en-US" w:bidi="he-IL"/>
-        </w:rPr>
-        <w:t xml:space="preserve"> ניתן ללמוד כי נמצא קשר חיובי מובהק ברמה בינונית בין רווחה נפשית ללגיטימיות </w:t>
-      </w:r>
-      <w:r>
-        <w:rPr>
-          <w:rFonts w:ascii="Times New Roman" w:cs="Times New Roman" w:eastAsia="Times New Roman" w:hAnsi="Times New Roman"/>
-          <w:noProof/>
-          <w:sz w:val="24"/>
-          <w:szCs w:val="24"/>
-          <w:lang w:val="en-US" w:bidi="he-IL"/>
-        </w:rPr>
-        <w:t xml:space="preserve">(r = 0.32, p &lt; 0.001)</w:t>
-      </w:r>
-      <w:r>
-        <w:rPr>
-          <w:rFonts w:ascii="David" w:cs="David" w:eastAsia="David" w:hAnsi="David"/>
-          <w:sz w:val="24"/>
-          <w:szCs w:val="24"/>
-          <w:rtl/>
-          <w:lang w:val="en-US" w:bidi="he-IL"/>
-        </w:rPr>
-        <w:t xml:space="preserve">: ככל שהשפוט מדווח על רווחה נפשית גבוהה יותר, כך הוא מייחס לסגל לגיטימיות גבוהה יותר, ולהפך. מתאם </w:t>
-      </w:r>
-      <w:r>
-        <w:rPr>
-          <w:rFonts w:ascii="David" w:cs="David" w:eastAsia="David" w:hAnsi="David"/>
-          <w:noProof/>
-          <w:sz w:val="24"/>
-          <w:szCs w:val="24"/>
-          <w:rtl/>
-          <w:lang w:val="en-US" w:bidi="he-IL"/>
-        </w:rPr>
-        <w:t xml:space="preserve">ספירמן</w:t>
-      </w:r>
-      <w:r>
-        <w:rPr>
-          <w:rFonts w:ascii="David" w:cs="David" w:eastAsia="David" w:hAnsi="David"/>
-          <w:sz w:val="24"/>
-          <w:szCs w:val="24"/>
-          <w:rtl/>
-          <w:lang w:val="en-US" w:bidi="he-IL"/>
-        </w:rPr>
-        <w:t xml:space="preserve"> (</w:t>
-      </w:r>
-      <w:r>
-        <w:rPr>
-          <w:rFonts w:ascii="Times New Roman" w:cs="Times New Roman" w:eastAsia="Times New Roman" w:hAnsi="Times New Roman"/>
-          <w:noProof/>
-          <w:sz w:val="24"/>
-          <w:szCs w:val="24"/>
-          <w:lang w:val="en-US" w:bidi="he-IL"/>
-        </w:rPr>
-        <w:t xml:space="preserve">0.34</w:t>
-      </w:r>
-      <w:r>
-        <w:rPr>
-          <w:rFonts w:ascii="David" w:cs="David" w:eastAsia="David" w:hAnsi="David"/>
-          <w:sz w:val="24"/>
-          <w:szCs w:val="24"/>
-          <w:rtl/>
-          <w:lang w:val="en-US" w:bidi="he-IL"/>
-        </w:rPr>
-        <w:t xml:space="preserve">) קרוב מאוד למתאם </w:t>
-      </w:r>
-      <w:r>
-        <w:rPr>
-          <w:rFonts w:ascii="David" w:cs="David" w:eastAsia="David" w:hAnsi="David"/>
-          <w:noProof/>
-          <w:sz w:val="24"/>
-          <w:szCs w:val="24"/>
-          <w:rtl/>
-          <w:lang w:val="en-US" w:bidi="he-IL"/>
-        </w:rPr>
-        <w:t xml:space="preserve">פירסון</w:t>
-      </w:r>
-      <w:r>
-        <w:rPr>
-          <w:rFonts w:ascii="David" w:cs="David" w:eastAsia="David" w:hAnsi="David"/>
-          <w:sz w:val="24"/>
-          <w:szCs w:val="24"/>
-          <w:rtl/>
-          <w:lang w:val="en-US" w:bidi="he-IL"/>
-        </w:rPr>
-        <w:t xml:space="preserve">, ומכאן שההטיה בהתפלגות הלגיטימיות אינה מעוותת את התמונה. הקשר קיים בכל שלושת הפריטים, והחזק שבהם הוא האפשרות לדבר עם הסוהרים כשמודאגים או עצובים (</w:t>
-      </w:r>
-      <w:r>
-        <w:rPr>
-          <w:rFonts w:ascii="Times New Roman" w:cs="Times New Roman" w:eastAsia="Times New Roman" w:hAnsi="Times New Roman"/>
-          <w:noProof/>
-          <w:sz w:val="24"/>
-          <w:szCs w:val="24"/>
-          <w:lang w:val="en-US" w:bidi="he-IL"/>
-        </w:rPr>
-        <w:t xml:space="preserve">0.29</w:t>
-      </w:r>
-      <w:r>
-        <w:rPr>
-          <w:rFonts w:ascii="David" w:cs="David" w:eastAsia="David" w:hAnsi="David"/>
-          <w:sz w:val="24"/>
-          <w:szCs w:val="24"/>
-          <w:rtl/>
-          <w:lang w:val="en-US" w:bidi="he-IL"/>
-        </w:rPr>
-        <w:t xml:space="preserve">). ממצא זה מתיישב עם הדגש של </w:t>
-      </w:r>
-      <w:r>
-        <w:rPr>
-          <w:rFonts w:ascii="David" w:cs="David" w:eastAsia="David" w:hAnsi="David"/>
-          <w:noProof/>
-          <w:sz w:val="24"/>
-          <w:szCs w:val="24"/>
-          <w:rtl/>
-          <w:lang w:val="en-US" w:bidi="he-IL"/>
-        </w:rPr>
-        <w:t xml:space="preserve">ספרקס</w:t>
-      </w:r>
-      <w:r>
-        <w:rPr>
-          <w:rFonts w:ascii="David" w:cs="David" w:eastAsia="David" w:hAnsi="David"/>
-          <w:sz w:val="24"/>
-          <w:szCs w:val="24"/>
-          <w:rtl/>
-          <w:lang w:val="en-US" w:bidi="he-IL"/>
-        </w:rPr>
-        <w:t xml:space="preserve"> </w:t>
-      </w:r>
-      <w:r>
-        <w:rPr>
-          <w:rFonts w:ascii="David" w:cs="David" w:eastAsia="David" w:hAnsi="David"/>
-          <w:noProof/>
-          <w:sz w:val="24"/>
-          <w:szCs w:val="24"/>
-          <w:rtl/>
-          <w:lang w:val="en-US" w:bidi="he-IL"/>
-        </w:rPr>
-        <w:t xml:space="preserve">ובוטומס</w:t>
-      </w:r>
-      <w:r>
-        <w:rPr>
-          <w:rFonts w:ascii="David" w:cs="David" w:eastAsia="David" w:hAnsi="David"/>
-          <w:sz w:val="24"/>
-          <w:szCs w:val="24"/>
-          <w:rtl/>
-          <w:lang w:val="en-US" w:bidi="he-IL"/>
-        </w:rPr>
-        <w:t xml:space="preserve"> (</w:t>
-      </w:r>
-      <w:r>
-        <w:rPr>
-          <w:rFonts w:ascii="Times New Roman" w:cs="Times New Roman" w:eastAsia="Times New Roman" w:hAnsi="Times New Roman"/>
-          <w:noProof/>
-          <w:sz w:val="24"/>
-          <w:szCs w:val="24"/>
-          <w:lang w:val="en-US" w:bidi="he-IL"/>
-        </w:rPr>
-        <w:t xml:space="preserve">1995</w:t>
-      </w:r>
-      <w:r>
-        <w:rPr>
-          <w:rFonts w:ascii="David" w:cs="David" w:eastAsia="David" w:hAnsi="David"/>
-          <w:sz w:val="24"/>
-          <w:szCs w:val="24"/>
-          <w:rtl/>
-          <w:lang w:val="en-US" w:bidi="he-IL"/>
-        </w:rPr>
-        <w:t xml:space="preserve">) על האיכות האנושית של שגרת היום כתנאי ללגיטימיות, ועם הממצא האוסטרלי שלפיו איכות היחסים עם הסגל היא המנגנון שדרכו צדק פרוצדורלי מתורגם לרווחה לאורך זמן </w:t>
-      </w:r>
-      <w:r>
-        <w:rPr>
-          <w:rFonts w:ascii="Times New Roman" w:cs="Times New Roman" w:eastAsia="Times New Roman" w:hAnsi="Times New Roman"/>
-          <w:noProof/>
-          <w:sz w:val="24"/>
-          <w:szCs w:val="24"/>
-          <w:lang w:val="en-US" w:bidi="he-IL"/>
-        </w:rPr>
-        <w:t xml:space="preserve">(Sargeant et al., 2026)</w:t>
-      </w:r>
-      <w:r>
-        <w:rPr>
-          <w:rFonts w:ascii="David" w:cs="David" w:eastAsia="David" w:hAnsi="David"/>
-          <w:sz w:val="24"/>
-          <w:szCs w:val="24"/>
-          <w:rtl/>
-          <w:lang w:val="en-US" w:bidi="he-IL"/>
-        </w:rPr>
-        <w:t xml:space="preserve">. השערת המחקר אוששה. לוח </w:t>
-      </w:r>
-      <w:r>
-        <w:rPr>
-          <w:rFonts w:ascii="Times New Roman" w:cs="Times New Roman" w:eastAsia="Times New Roman" w:hAnsi="Times New Roman"/>
-          <w:noProof/>
-          <w:sz w:val="24"/>
-          <w:szCs w:val="24"/>
-          <w:lang w:val="en-US" w:bidi="he-IL"/>
-        </w:rPr>
-        <w:t xml:space="preserve">7</w:t>
       </w:r>
       <w:r>
         <w:rPr>
@@ -15687,7 +13894,7 @@
           <w:szCs w:val="24"/>
           <w:lang w:val="en-US" w:bidi="he-IL"/>
         </w:rPr>
-        <w:t xml:space="preserve">7</w:t>
+        <w:t xml:space="preserve">6</w:t>
       </w:r>
       <w:r>
         <w:rPr>
@@ -16560,7 +14767,7 @@
           <w:szCs w:val="24"/>
           <w:lang w:val="en-US" w:bidi="he-IL"/>
         </w:rPr>
-        <w:t xml:space="preserve">7</w:t>
+        <w:t xml:space="preserve">6</w:t>
       </w:r>
       <w:r>
         <w:rPr>
@@ -16779,7 +14986,7 @@
           <w:szCs w:val="24"/>
           <w:lang w:val="en-US" w:bidi="he-IL"/>
         </w:rPr>
-        <w:t xml:space="preserve">7</w:t>
+        <w:t xml:space="preserve">6</w:t>
       </w:r>
       <w:r>
         <w:rPr>
@@ -17419,7 +15626,7 @@
           <w:szCs w:val="24"/>
           <w:lang w:val="en-US" w:bidi="he-IL"/>
         </w:rPr>
-        <w:t xml:space="preserve">7,</w:t>
+        <w:t xml:space="preserve">6,</w:t>
       </w:r>
       <w:r>
         <w:rPr>
@@ -18713,7 +16920,7 @@
           <w:rtl/>
           <w:lang w:val="en-US" w:bidi="he-IL"/>
         </w:rPr>
-        <w:t xml:space="preserve"> נקודות ברווחה בין רמת הלגיטימיות הנמוכה לגבוהה. הממצאים תואמים את המחקרים מהולנד, מאנגליה, מאוסטרליה ומארצות הברית, ומצביעים על כך שרווחתו הנפשית של השפוט אינה עניין טיפולי בלבד אלא מרכיב בסדר ובציות באגף. ההמלצות המעשיות, סינון רווחה נפשית בקליטה ואחריה, שעת קבלה שבועית של סוהרי האגף, הכשרה בצדק פרוצדורלי ומדידה שנתית ברמת האגף, ממתינות לבדיקה בנתונים ממשיים ובמערך אורך.</w:t>
+        <w:t xml:space="preserve"> נקודות ברווחה בין רמת הלגיטימיות הנמוכה לגבוהה. הממצאים תואמים את המחקרים מהולנד, מאנגליה, מאוסטרליה ומארצות הברית, ומצביעים על כך שרווחתו הנפשית של השפוט אינה עניין טיפולי בלבד אלא מרכיב בסדר ובציות באגף. ההמלצות המעשיות, סינון רווחה נפשית בקליטה ואחריה, שעת קבלה שבועית של סוהרי האגף, הכשרה בצדק פרוצדורלי, מדידה שנתית ברמת האגף ונציגות אסירים של האגף, ממתינות לבדיקה בנתונים ממשיים ובמערך אורך.</w:t>
       </w:r>
     </w:p>
     <w:p>
@@ -18912,7 +17119,7 @@
           <w:rtl/>
           <w:lang w:val="en-US" w:bidi="he-IL"/>
         </w:rPr>
-        <w:t xml:space="preserve">נוסף על כך נעשה שימוש בכלי בינה מלאכותית לצורכי עריכה לשונית, תרגום התקציר לאנגלית, סיוע באיתור מקורות ובעיצוב המסמך. בחירת שאלת המחקר, קריאת המקורות, פירוש הממצאים והמסקנות הם של הכותבות.</w:t>
+        <w:t xml:space="preserve">נוסף על כך נעשה שימוש בכלי בינה מלאכותית לצורכי עריכה לשונית, תרגום התקציר לאנגלית ועיצוב המסמך. בחירת שאלת המחקר, קריאת המקורות, פירוש הממצאים והמסקנות הם של הכותבות.</w:t>
       </w:r>
     </w:p>
     <w:p>

</xml_diff>